<commit_message>
Use structured items for education lists
Convert training and scholarship entries in the Italian i18n file from plain strings to objects with a `text` field and update rendering accordingly (script.js now maps `item.text`). Add a fallback `trainingItems` to the generated curriculum. Replace the CV binary and remove a leftover temp file (~$_Mirko_Ando.docx). Also include a minor whitespace cleanup in index.html.
</commit_message>
<xml_diff>
--- a/src/profile/CV_Mirko_Ando.docx
+++ b/src/profile/CV_Mirko_Ando.docx
@@ -12,16 +12,16 @@
           <w:noProof/>
         </w:rPr>
         <w:drawing>
-          <wp:anchor distT="0" distB="0" distL="114300" distR="114300" simplePos="0" relativeHeight="251661312" behindDoc="1" locked="0" layoutInCell="1" allowOverlap="1" wp14:anchorId="5175737A" wp14:editId="5A09B7FA">
+          <wp:anchor distT="0" distB="0" distL="114300" distR="114300" simplePos="0" relativeHeight="251661312" behindDoc="1" locked="0" layoutInCell="1" allowOverlap="1" wp14:anchorId="5175737A" wp14:editId="65242ABE">
             <wp:simplePos x="0" y="0"/>
             <wp:positionH relativeFrom="column">
-              <wp:posOffset>5784215</wp:posOffset>
+              <wp:posOffset>5231861</wp:posOffset>
             </wp:positionH>
             <wp:positionV relativeFrom="paragraph">
-              <wp:posOffset>-587375</wp:posOffset>
+              <wp:posOffset>103470</wp:posOffset>
             </wp:positionV>
             <wp:extent cx="1433830" cy="2152090"/>
-            <wp:effectExtent l="0" t="0" r="0" b="635"/>
+            <wp:effectExtent l="190500" t="152400" r="166370" b="191135"/>
             <wp:wrapNone/>
             <wp:docPr id="419781564" name="Immagine 1"/>
             <wp:cNvGraphicFramePr>
@@ -54,6 +54,36 @@
                     <a:prstGeom prst="rect">
                       <a:avLst/>
                     </a:prstGeom>
+                    <a:solidFill>
+                      <a:srgbClr val="FFFFFF">
+                        <a:shade val="85000"/>
+                      </a:srgbClr>
+                    </a:solidFill>
+                    <a:ln w="190500" cap="sq">
+                      <a:solidFill>
+                        <a:srgbClr val="FFFFFF"/>
+                      </a:solidFill>
+                      <a:miter lim="800000"/>
+                    </a:ln>
+                    <a:effectLst>
+                      <a:outerShdw blurRad="55000" dist="18000" dir="5400000" algn="tl" rotWithShape="0">
+                        <a:srgbClr val="000000">
+                          <a:alpha val="40000"/>
+                        </a:srgbClr>
+                      </a:outerShdw>
+                    </a:effectLst>
+                    <a:scene3d>
+                      <a:camera prst="orthographicFront"/>
+                      <a:lightRig rig="twoPt" dir="t">
+                        <a:rot lat="0" lon="0" rev="7200000"/>
+                      </a:lightRig>
+                    </a:scene3d>
+                    <a:sp3d>
+                      <a:bevelT w="25400" h="19050"/>
+                      <a:contourClr>
+                        <a:srgbClr val="FFFFFF"/>
+                      </a:contourClr>
+                    </a:sp3d>
                   </pic:spPr>
                 </pic:pic>
               </a:graphicData>
@@ -141,7 +171,7 @@
                 <w:lang w:val="it-IT"/>
               </w:rPr>
               <w:drawing>
-                <wp:inline distT="0" distB="0" distL="0" distR="0" wp14:anchorId="782075E1" wp14:editId="105724F0">
+                <wp:inline distT="0" distB="0" distL="0" distR="0" wp14:anchorId="782075E1" wp14:editId="084D2374">
                   <wp:extent cx="361950" cy="247650"/>
                   <wp:effectExtent l="0" t="0" r="0" b="0"/>
                   <wp:docPr id="1" name="Immagine1"/>
@@ -202,79 +232,6 @@
           <w:lang w:val="it-IT"/>
         </w:rPr>
       </w:pPr>
-      <w:r>
-        <w:rPr>
-          <w:noProof/>
-        </w:rPr>
-        <mc:AlternateContent>
-          <mc:Choice Requires="wps">
-            <w:drawing>
-              <wp:anchor distT="0" distB="0" distL="114299" distR="114299" simplePos="0" relativeHeight="251659264" behindDoc="0" locked="0" layoutInCell="1" allowOverlap="1" wp14:anchorId="101ECE9E" wp14:editId="102266B0">
-                <wp:simplePos x="0" y="0"/>
-                <wp:positionH relativeFrom="page">
-                  <wp:posOffset>2279015</wp:posOffset>
-                </wp:positionH>
-                <wp:positionV relativeFrom="page">
-                  <wp:posOffset>623570</wp:posOffset>
-                </wp:positionV>
-                <wp:extent cx="0" cy="9559290"/>
-                <wp:effectExtent l="19050" t="19050" r="38100" b="41910"/>
-                <wp:wrapNone/>
-                <wp:docPr id="2" name="Connettore 2 4"/>
-                <wp:cNvGraphicFramePr>
-                  <a:graphicFrameLocks xmlns:a="http://schemas.openxmlformats.org/drawingml/2006/main"/>
-                </wp:cNvGraphicFramePr>
-                <a:graphic xmlns:a="http://schemas.openxmlformats.org/drawingml/2006/main">
-                  <a:graphicData uri="http://schemas.microsoft.com/office/word/2010/wordprocessingShape">
-                    <wps:wsp>
-                      <wps:cNvCnPr>
-                        <a:cxnSpLocks/>
-                      </wps:cNvCnPr>
-                      <wps:spPr>
-                        <a:xfrm>
-                          <a:off x="0" y="0"/>
-                          <a:ext cx="0" cy="9559290"/>
-                        </a:xfrm>
-                        <a:prstGeom prst="straightConnector1">
-                          <a:avLst/>
-                        </a:prstGeom>
-                        <a:noFill/>
-                        <a:ln w="9363" cap="sq">
-                          <a:solidFill>
-                            <a:srgbClr val="000000"/>
-                          </a:solidFill>
-                          <a:prstDash val="solid"/>
-                          <a:miter/>
-                        </a:ln>
-                      </wps:spPr>
-                      <wps:bodyPr/>
-                    </wps:wsp>
-                  </a:graphicData>
-                </a:graphic>
-                <wp14:sizeRelH relativeFrom="page">
-                  <wp14:pctWidth>0</wp14:pctWidth>
-                </wp14:sizeRelH>
-                <wp14:sizeRelV relativeFrom="page">
-                  <wp14:pctHeight>0</wp14:pctHeight>
-                </wp14:sizeRelV>
-              </wp:anchor>
-            </w:drawing>
-          </mc:Choice>
-          <mc:Fallback>
-            <w:pict>
-              <v:shapetype w14:anchorId="75D6E194" id="_x0000_t32" coordsize="21600,21600" o:spt="32" o:oned="t" path="m,l21600,21600e" filled="f">
-                <v:path arrowok="t" fillok="f" o:connecttype="none"/>
-                <o:lock v:ext="edit" shapetype="t"/>
-              </v:shapetype>
-              <v:shape id="Connettore 2 4" o:spid="_x0000_s1026" type="#_x0000_t32" style="position:absolute;margin-left:179.45pt;margin-top:49.1pt;width:0;height:752.7pt;z-index:251659264;visibility:visible;mso-wrap-style:square;mso-width-percent:0;mso-height-percent:0;mso-wrap-distance-left:3.17497mm;mso-wrap-distance-top:0;mso-wrap-distance-right:3.17497mm;mso-wrap-distance-bottom:0;mso-position-horizontal:absolute;mso-position-horizontal-relative:page;mso-position-vertical:absolute;mso-position-vertical-relative:page;mso-width-percent:0;mso-height-percent:0;mso-width-relative:page;mso-height-relative:page" o:gfxdata="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" strokeweight=".26008mm">
-                <v:stroke joinstyle="miter" endcap="square"/>
-                <o:lock v:ext="edit" shapetype="f"/>
-                <w10:wrap anchorx="page" anchory="page"/>
-              </v:shape>
-            </w:pict>
-          </mc:Fallback>
-        </mc:AlternateContent>
-      </w:r>
     </w:p>
     <w:p>
       <w:pPr>
@@ -1281,6 +1238,76 @@
       <w:r>
         <w:rPr>
           <w:rFonts w:ascii="Arial Narrow" w:hAnsi="Arial Narrow" w:cs="Arial Narrow"/>
+          <w:noProof/>
+          <w:lang w:val="it-IT"/>
+          <w14:ligatures w14:val="standardContextual"/>
+        </w:rPr>
+        <mc:AlternateContent>
+          <mc:Choice Requires="wpi">
+            <w:drawing>
+              <wp:anchor distT="0" distB="0" distL="114300" distR="114300" simplePos="0" relativeHeight="251666432" behindDoc="0" locked="0" layoutInCell="1" allowOverlap="1" wp14:anchorId="6925156A" wp14:editId="176E0A44">
+                <wp:simplePos x="0" y="0"/>
+                <wp:positionH relativeFrom="column">
+                  <wp:posOffset>1899920</wp:posOffset>
+                </wp:positionH>
+                <wp:positionV relativeFrom="paragraph">
+                  <wp:posOffset>-4336067</wp:posOffset>
+                </wp:positionV>
+                <wp:extent cx="0" cy="10070465"/>
+                <wp:effectExtent l="57150" t="57150" r="57150" b="45085"/>
+                <wp:wrapNone/>
+                <wp:docPr id="269334042" name="Input penna 7"/>
+                <wp:cNvGraphicFramePr/>
+                <a:graphic xmlns:a="http://schemas.openxmlformats.org/drawingml/2006/main">
+                  <a:graphicData uri="http://schemas.microsoft.com/office/word/2010/wordprocessingInk">
+                    <w14:contentPart bwMode="auto" r:id="rId8">
+                      <w14:nvContentPartPr>
+                        <w14:cNvContentPartPr/>
+                      </w14:nvContentPartPr>
+                      <w14:xfrm>
+                        <a:off x="0" y="0"/>
+                        <a:ext cx="0" cy="10070465"/>
+                      </w14:xfrm>
+                    </w14:contentPart>
+                  </a:graphicData>
+                </a:graphic>
+                <wp14:sizeRelV relativeFrom="margin">
+                  <wp14:pctHeight>0</wp14:pctHeight>
+                </wp14:sizeRelV>
+              </wp:anchor>
+            </w:drawing>
+          </mc:Choice>
+          <mc:Fallback>
+            <w:pict>
+              <v:shapetype w14:anchorId="52220FC9" id="_x0000_t75" coordsize="21600,21600" o:spt="75" o:preferrelative="t" path="m@4@5l@4@11@9@11@9@5xe" filled="f" stroked="f">
+                <v:stroke joinstyle="miter"/>
+                <v:formulas>
+                  <v:f eqn="if lineDrawn pixelLineWidth 0"/>
+                  <v:f eqn="sum @0 1 0"/>
+                  <v:f eqn="sum 0 0 @1"/>
+                  <v:f eqn="prod @2 1 2"/>
+                  <v:f eqn="prod @3 21600 pixelWidth"/>
+                  <v:f eqn="prod @3 21600 pixelHeight"/>
+                  <v:f eqn="sum @0 0 1"/>
+                  <v:f eqn="prod @6 1 2"/>
+                  <v:f eqn="prod @7 21600 pixelWidth"/>
+                  <v:f eqn="sum @8 21600 0"/>
+                  <v:f eqn="prod @7 21600 pixelHeight"/>
+                  <v:f eqn="sum @10 21600 0"/>
+                </v:formulas>
+                <v:path o:extrusionok="f" gradientshapeok="t" o:connecttype="rect"/>
+                <o:lock v:ext="edit" aspectratio="t"/>
+              </v:shapetype>
+              <v:shape id="Input penna 7" o:spid="_x0000_s1026" type="#_x0000_t75" style="position:absolute;margin-left:149.6pt;margin-top:-342.1pt;width:0;height:794.35pt;z-index:251666432;visibility:visible;mso-wrap-style:square;mso-height-percent:0;mso-wrap-distance-left:9pt;mso-wrap-distance-top:0;mso-wrap-distance-right:9pt;mso-wrap-distance-bottom:0;mso-position-horizontal:absolute;mso-position-horizontal-relative:text;mso-position-vertical:absolute;mso-position-vertical-relative:text;mso-height-percent:0;mso-height-relative:margin" o:gfxdata="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">
+                <v:imagedata r:id="rId9" o:title=""/>
+              </v:shape>
+            </w:pict>
+          </mc:Fallback>
+        </mc:AlternateContent>
+      </w:r>
+      <w:r>
+        <w:rPr>
+          <w:rFonts w:ascii="Arial Narrow" w:hAnsi="Arial Narrow" w:cs="Arial Narrow"/>
           <w:b/>
           <w:lang w:val="it-IT"/>
         </w:rPr>
@@ -1289,7 +1316,7 @@
     </w:p>
     <w:tbl>
       <w:tblPr>
-        <w:tblW w:w="10456" w:type="dxa"/>
+        <w:tblW w:w="10617" w:type="dxa"/>
         <w:tblInd w:w="-108" w:type="dxa"/>
         <w:tblLayout w:type="fixed"/>
         <w:tblCellMar>
@@ -1299,14 +1326,17 @@
         <w:tblLook w:val="0000" w:firstRow="0" w:lastRow="0" w:firstColumn="0" w:lastColumn="0" w:noHBand="0" w:noVBand="0"/>
       </w:tblPr>
       <w:tblGrid>
-        <w:gridCol w:w="2943"/>
-        <w:gridCol w:w="284"/>
-        <w:gridCol w:w="7229"/>
+        <w:gridCol w:w="2988"/>
+        <w:gridCol w:w="288"/>
+        <w:gridCol w:w="7341"/>
       </w:tblGrid>
       <w:tr>
-        <w:tc>
-          <w:tcPr>
-            <w:tcW w:w="2943" w:type="dxa"/>
+        <w:trPr>
+          <w:trHeight w:val="654"/>
+        </w:trPr>
+        <w:tc>
+          <w:tcPr>
+            <w:tcW w:w="2988" w:type="dxa"/>
             <w:tcMar>
               <w:top w:w="0" w:type="dxa"/>
               <w:left w:w="108" w:type="dxa"/>
@@ -1327,7 +1357,7 @@
         </w:tc>
         <w:tc>
           <w:tcPr>
-            <w:tcW w:w="284" w:type="dxa"/>
+            <w:tcW w:w="288" w:type="dxa"/>
             <w:tcMar>
               <w:top w:w="0" w:type="dxa"/>
               <w:left w:w="108" w:type="dxa"/>
@@ -1351,7 +1381,7 @@
         </w:tc>
         <w:tc>
           <w:tcPr>
-            <w:tcW w:w="7229" w:type="dxa"/>
+            <w:tcW w:w="7341" w:type="dxa"/>
             <w:tcMar>
               <w:top w:w="0" w:type="dxa"/>
               <w:left w:w="108" w:type="dxa"/>
@@ -1463,9 +1493,12 @@
         </w:tc>
       </w:tr>
       <w:tr>
-        <w:tc>
-          <w:tcPr>
-            <w:tcW w:w="2943" w:type="dxa"/>
+        <w:trPr>
+          <w:trHeight w:val="205"/>
+        </w:trPr>
+        <w:tc>
+          <w:tcPr>
+            <w:tcW w:w="2988" w:type="dxa"/>
             <w:tcMar>
               <w:top w:w="0" w:type="dxa"/>
               <w:left w:w="108" w:type="dxa"/>
@@ -1487,7 +1520,7 @@
         </w:tc>
         <w:tc>
           <w:tcPr>
-            <w:tcW w:w="284" w:type="dxa"/>
+            <w:tcW w:w="288" w:type="dxa"/>
             <w:tcMar>
               <w:top w:w="0" w:type="dxa"/>
               <w:left w:w="108" w:type="dxa"/>
@@ -1511,7 +1544,7 @@
         </w:tc>
         <w:tc>
           <w:tcPr>
-            <w:tcW w:w="7229" w:type="dxa"/>
+            <w:tcW w:w="7341" w:type="dxa"/>
             <w:tcMar>
               <w:top w:w="0" w:type="dxa"/>
               <w:left w:w="108" w:type="dxa"/>
@@ -1539,9 +1572,12 @@
         </w:tc>
       </w:tr>
       <w:tr>
-        <w:tc>
-          <w:tcPr>
-            <w:tcW w:w="2943" w:type="dxa"/>
+        <w:trPr>
+          <w:trHeight w:val="215"/>
+        </w:trPr>
+        <w:tc>
+          <w:tcPr>
+            <w:tcW w:w="2988" w:type="dxa"/>
             <w:tcMar>
               <w:top w:w="0" w:type="dxa"/>
               <w:left w:w="108" w:type="dxa"/>
@@ -1554,6 +1590,7 @@
               <w:pStyle w:val="OiaeaeiYiio2"/>
               <w:widowControl/>
               <w:spacing w:before="20" w:after="20"/>
+              <w:jc w:val="left"/>
               <w:rPr>
                 <w:rFonts w:ascii="Arial Narrow" w:hAnsi="Arial Narrow"/>
                 <w:lang w:val="it-IT"/>
@@ -1563,7 +1600,7 @@
         </w:tc>
         <w:tc>
           <w:tcPr>
-            <w:tcW w:w="284" w:type="dxa"/>
+            <w:tcW w:w="288" w:type="dxa"/>
             <w:tcMar>
               <w:top w:w="0" w:type="dxa"/>
               <w:left w:w="108" w:type="dxa"/>
@@ -1582,11 +1619,62 @@
                 <w:lang w:val="it-IT"/>
               </w:rPr>
             </w:pPr>
-          </w:p>
-        </w:tc>
-        <w:tc>
-          <w:tcPr>
-            <w:tcW w:w="7229" w:type="dxa"/>
+            <w:r>
+              <w:rPr>
+                <w:rFonts w:ascii="Arial Narrow" w:hAnsi="Arial Narrow" w:cs="Arial Narrow"/>
+                <w:noProof/>
+                <w:lang w:val="it-IT"/>
+                <w14:ligatures w14:val="standardContextual"/>
+              </w:rPr>
+              <mc:AlternateContent>
+                <mc:Choice Requires="wpi">
+                  <w:drawing>
+                    <wp:anchor distT="0" distB="0" distL="114300" distR="114300" simplePos="0" relativeHeight="251662336" behindDoc="0" locked="0" layoutInCell="1" allowOverlap="1" wp14:anchorId="7D64E976" wp14:editId="3C634103">
+                      <wp:simplePos x="0" y="0"/>
+                      <wp:positionH relativeFrom="column">
+                        <wp:posOffset>-3175</wp:posOffset>
+                      </wp:positionH>
+                      <wp:positionV relativeFrom="paragraph">
+                        <wp:posOffset>-4999990</wp:posOffset>
+                      </wp:positionV>
+                      <wp:extent cx="360" cy="9658302"/>
+                      <wp:effectExtent l="57150" t="57150" r="57150" b="57785"/>
+                      <wp:wrapNone/>
+                      <wp:docPr id="1856874028" name="Input penna 7"/>
+                      <wp:cNvGraphicFramePr/>
+                      <a:graphic xmlns:a="http://schemas.openxmlformats.org/drawingml/2006/main">
+                        <a:graphicData uri="http://schemas.microsoft.com/office/word/2010/wordprocessingInk">
+                          <w14:contentPart bwMode="auto" r:id="rId10">
+                            <w14:nvContentPartPr>
+                              <w14:cNvContentPartPr/>
+                            </w14:nvContentPartPr>
+                            <w14:xfrm>
+                              <a:off x="0" y="0"/>
+                              <a:ext cx="360" cy="9658302"/>
+                            </w14:xfrm>
+                          </w14:contentPart>
+                        </a:graphicData>
+                      </a:graphic>
+                      <wp14:sizeRelV relativeFrom="margin">
+                        <wp14:pctHeight>0</wp14:pctHeight>
+                      </wp14:sizeRelV>
+                    </wp:anchor>
+                  </w:drawing>
+                </mc:Choice>
+                <mc:Fallback>
+                  <w:pict>
+                    <v:shape w14:anchorId="47935B12" id="Input penna 7" o:spid="_x0000_s1026" type="#_x0000_t75" style="position:absolute;margin-left:-.95pt;margin-top:-394.4pt;width:1.45pt;height:761.95pt;z-index:251662336;visibility:visible;mso-wrap-style:square;mso-height-percent:0;mso-wrap-distance-left:9pt;mso-wrap-distance-top:0;mso-wrap-distance-right:9pt;mso-wrap-distance-bottom:0;mso-position-horizontal:absolute;mso-position-horizontal-relative:text;mso-position-vertical:absolute;mso-position-vertical-relative:text;mso-height-percent:0;mso-height-relative:margin" o:gfxdata="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">
+                      <v:imagedata r:id="rId11" o:title=""/>
+                    </v:shape>
+                  </w:pict>
+                </mc:Fallback>
+              </mc:AlternateContent>
+            </w:r>
+          </w:p>
+        </w:tc>
+        <w:tc>
+          <w:tcPr>
+            <w:tcW w:w="7341" w:type="dxa"/>
             <w:tcMar>
               <w:top w:w="0" w:type="dxa"/>
               <w:left w:w="108" w:type="dxa"/>
@@ -1614,9 +1702,12 @@
         </w:tc>
       </w:tr>
       <w:tr>
-        <w:tc>
-          <w:tcPr>
-            <w:tcW w:w="2943" w:type="dxa"/>
+        <w:trPr>
+          <w:trHeight w:val="205"/>
+        </w:trPr>
+        <w:tc>
+          <w:tcPr>
+            <w:tcW w:w="2988" w:type="dxa"/>
             <w:tcMar>
               <w:top w:w="0" w:type="dxa"/>
               <w:left w:w="108" w:type="dxa"/>
@@ -1637,7 +1728,7 @@
         </w:tc>
         <w:tc>
           <w:tcPr>
-            <w:tcW w:w="284" w:type="dxa"/>
+            <w:tcW w:w="288" w:type="dxa"/>
             <w:tcMar>
               <w:top w:w="0" w:type="dxa"/>
               <w:left w:w="108" w:type="dxa"/>
@@ -1661,7 +1752,7 @@
         </w:tc>
         <w:tc>
           <w:tcPr>
-            <w:tcW w:w="7229" w:type="dxa"/>
+            <w:tcW w:w="7341" w:type="dxa"/>
             <w:tcMar>
               <w:top w:w="0" w:type="dxa"/>
               <w:left w:w="108" w:type="dxa"/>
@@ -1689,9 +1780,12 @@
         </w:tc>
       </w:tr>
       <w:tr>
-        <w:tc>
-          <w:tcPr>
-            <w:tcW w:w="2943" w:type="dxa"/>
+        <w:trPr>
+          <w:trHeight w:val="400"/>
+        </w:trPr>
+        <w:tc>
+          <w:tcPr>
+            <w:tcW w:w="2988" w:type="dxa"/>
             <w:tcMar>
               <w:top w:w="0" w:type="dxa"/>
               <w:left w:w="108" w:type="dxa"/>
@@ -1702,7 +1796,7 @@
           <w:tbl>
             <w:tblPr>
               <w:tblpPr w:leftFromText="141" w:rightFromText="141" w:vertAnchor="text" w:horzAnchor="margin" w:tblpY="-73"/>
-              <w:tblW w:w="2943" w:type="dxa"/>
+              <w:tblW w:w="2988" w:type="dxa"/>
               <w:tblLayout w:type="fixed"/>
               <w:tblCellMar>
                 <w:left w:w="10" w:type="dxa"/>
@@ -1711,12 +1805,15 @@
               <w:tblLook w:val="0000" w:firstRow="0" w:lastRow="0" w:firstColumn="0" w:lastColumn="0" w:noHBand="0" w:noVBand="0"/>
             </w:tblPr>
             <w:tblGrid>
-              <w:gridCol w:w="2943"/>
+              <w:gridCol w:w="2988"/>
             </w:tblGrid>
             <w:tr>
+              <w:trPr>
+                <w:trHeight w:val="400"/>
+              </w:trPr>
               <w:tc>
                 <w:tcPr>
-                  <w:tcW w:w="2943" w:type="dxa"/>
+                  <w:tcW w:w="2988" w:type="dxa"/>
                   <w:tcMar>
                     <w:top w:w="0" w:type="dxa"/>
                     <w:left w:w="108" w:type="dxa"/>
@@ -1761,7 +1858,7 @@
         </w:tc>
         <w:tc>
           <w:tcPr>
-            <w:tcW w:w="284" w:type="dxa"/>
+            <w:tcW w:w="288" w:type="dxa"/>
             <w:tcMar>
               <w:top w:w="0" w:type="dxa"/>
               <w:left w:w="108" w:type="dxa"/>
@@ -1785,7 +1882,7 @@
         </w:tc>
         <w:tc>
           <w:tcPr>
-            <w:tcW w:w="7229" w:type="dxa"/>
+            <w:tcW w:w="7341" w:type="dxa"/>
             <w:tcMar>
               <w:top w:w="0" w:type="dxa"/>
               <w:left w:w="108" w:type="dxa"/>
@@ -1865,24 +1962,122 @@
               <w:pStyle w:val="OiaeaeiYiio2"/>
               <w:widowControl/>
               <w:spacing w:before="20" w:after="20"/>
-            </w:pPr>
-            <w:r>
+              <w:rPr>
+                <w:rFonts w:ascii="Arial Narrow" w:hAnsi="Arial Narrow"/>
+                <w:i w:val="0"/>
+                <w:iCs/>
+                <w:sz w:val="18"/>
+                <w:szCs w:val="22"/>
+              </w:rPr>
+            </w:pPr>
+            <w:r>
+              <w:rPr>
+                <w:rFonts w:ascii="Arial Narrow" w:hAnsi="Arial Narrow"/>
+                <w:i w:val="0"/>
+                <w:iCs/>
+                <w:sz w:val="18"/>
+                <w:szCs w:val="22"/>
+              </w:rPr>
+              <w:t>{{</w:t>
+            </w:r>
+            <w:proofErr w:type="gramStart"/>
+            <w:r>
+              <w:rPr>
+                <w:rFonts w:ascii="Arial Narrow" w:hAnsi="Arial Narrow"/>
+                <w:i w:val="0"/>
+                <w:iCs/>
+                <w:sz w:val="18"/>
+                <w:szCs w:val="22"/>
+              </w:rPr>
+              <w:t>education.tra</w:t>
+            </w:r>
+            <w:r>
+              <w:rPr>
+                <w:rFonts w:ascii="Arial Narrow" w:hAnsi="Arial Narrow"/>
+                <w:i w:val="0"/>
+                <w:iCs/>
+                <w:sz w:val="18"/>
+                <w:szCs w:val="22"/>
+              </w:rPr>
+              <w:t>in</w:t>
+            </w:r>
+            <w:r>
+              <w:rPr>
+                <w:rFonts w:ascii="Arial Narrow" w:hAnsi="Arial Narrow"/>
+                <w:i w:val="0"/>
+                <w:iCs/>
+                <w:sz w:val="18"/>
+                <w:szCs w:val="22"/>
+              </w:rPr>
+              <w:t>ingTitle</w:t>
+            </w:r>
+            <w:proofErr w:type="gramEnd"/>
+            <w:r>
+              <w:rPr>
+                <w:rFonts w:ascii="Arial Narrow" w:hAnsi="Arial Narrow"/>
+                <w:i w:val="0"/>
+                <w:iCs/>
+                <w:sz w:val="18"/>
+                <w:szCs w:val="22"/>
+              </w:rPr>
+              <w:t>}}</w:t>
+            </w:r>
+          </w:p>
+        </w:tc>
+        <w:tc>
+          <w:tcPr>
+            <w:tcW w:w="284" w:type="dxa"/>
+            <w:tcMar>
+              <w:top w:w="0" w:type="dxa"/>
+              <w:left w:w="108" w:type="dxa"/>
+              <w:bottom w:w="0" w:type="dxa"/>
+              <w:right w:w="108" w:type="dxa"/>
+            </w:tcMar>
+          </w:tcPr>
+          <w:p>
+            <w:pPr>
+              <w:pStyle w:val="Aaoeeu"/>
+              <w:widowControl/>
+              <w:snapToGrid w:val="0"/>
+              <w:spacing w:before="20" w:after="20"/>
+              <w:rPr>
+                <w:rFonts w:ascii="Arial Narrow" w:hAnsi="Arial Narrow" w:cs="Arial Narrow"/>
+                <w:lang w:val="it-IT"/>
+              </w:rPr>
+            </w:pPr>
+          </w:p>
+        </w:tc>
+        <w:tc>
+          <w:tcPr>
+            <w:tcW w:w="7229" w:type="dxa"/>
+            <w:tcMar>
+              <w:top w:w="0" w:type="dxa"/>
+              <w:left w:w="108" w:type="dxa"/>
+              <w:bottom w:w="0" w:type="dxa"/>
+              <w:right w:w="108" w:type="dxa"/>
+            </w:tcMar>
+          </w:tcPr>
+          <w:p>
+            <w:pPr>
+              <w:pStyle w:val="OiaeaeiYiio2"/>
+              <w:widowControl/>
+              <w:spacing w:before="20" w:after="20"/>
+              <w:jc w:val="left"/>
               <w:rPr>
                 <w:rFonts w:ascii="Arial Narrow" w:hAnsi="Arial Narrow" w:cs="Arial Narrow"/>
                 <w:i w:val="0"/>
                 <w:sz w:val="20"/>
                 <w:lang w:val="it-IT"/>
               </w:rPr>
-              <w:t>•</w:t>
-            </w:r>
-            <w:r>
-              <w:rPr>
-                <w:rFonts w:ascii="Arial Narrow" w:eastAsia="Times New Roman" w:hAnsi="Arial Narrow" w:cs="Arial Narrow"/>
+            </w:pPr>
+            <w:r>
+              <w:rPr>
+                <w:rFonts w:ascii="Arial Narrow" w:hAnsi="Arial Narrow" w:cs="Arial Narrow"/>
                 <w:i w:val="0"/>
                 <w:sz w:val="20"/>
                 <w:lang w:val="it-IT"/>
               </w:rPr>
-              <w:t xml:space="preserve"> </w:t>
+              <w:t>{{education.</w:t>
             </w:r>
             <w:r>
               <w:rPr>
@@ -1891,43 +2086,18 @@
                 <w:sz w:val="20"/>
                 <w:lang w:val="it-IT"/>
               </w:rPr>
-              <w:t>Date (da – a)</w:t>
-            </w:r>
-          </w:p>
-        </w:tc>
-        <w:tc>
-          <w:tcPr>
-            <w:tcW w:w="284" w:type="dxa"/>
-            <w:tcMar>
-              <w:top w:w="0" w:type="dxa"/>
-              <w:left w:w="108" w:type="dxa"/>
-              <w:bottom w:w="0" w:type="dxa"/>
-              <w:right w:w="108" w:type="dxa"/>
-            </w:tcMar>
-          </w:tcPr>
-          <w:p>
-            <w:pPr>
-              <w:pStyle w:val="Aaoeeu"/>
-              <w:widowControl/>
-              <w:snapToGrid w:val="0"/>
-              <w:spacing w:before="20" w:after="20"/>
-              <w:rPr>
-                <w:rFonts w:ascii="Arial Narrow" w:hAnsi="Arial Narrow" w:cs="Arial Narrow"/>
-                <w:lang w:val="it-IT"/>
-              </w:rPr>
-            </w:pPr>
-          </w:p>
-        </w:tc>
-        <w:tc>
-          <w:tcPr>
-            <w:tcW w:w="7229" w:type="dxa"/>
-            <w:tcMar>
-              <w:top w:w="0" w:type="dxa"/>
-              <w:left w:w="108" w:type="dxa"/>
-              <w:bottom w:w="0" w:type="dxa"/>
-              <w:right w:w="108" w:type="dxa"/>
-            </w:tcMar>
-          </w:tcPr>
+              <w:t>trainingDescription</w:t>
+            </w:r>
+            <w:r>
+              <w:rPr>
+                <w:rFonts w:ascii="Arial Narrow" w:hAnsi="Arial Narrow" w:cs="Arial Narrow"/>
+                <w:i w:val="0"/>
+                <w:sz w:val="20"/>
+                <w:lang w:val="it-IT"/>
+              </w:rPr>
+              <w:t>}}</w:t>
+            </w:r>
+          </w:p>
           <w:p>
             <w:pPr>
               <w:pStyle w:val="OiaeaeiYiio2"/>
@@ -1948,7 +2118,7 @@
                 <w:sz w:val="20"/>
                 <w:lang w:val="it-IT"/>
               </w:rPr>
-              <w:t>{{education.</w:t>
+              <w:t>{{#</w:t>
             </w:r>
             <w:r>
               <w:rPr>
@@ -1957,7 +2127,7 @@
                 <w:sz w:val="20"/>
                 <w:lang w:val="it-IT"/>
               </w:rPr>
-              <w:t>trainingDescription</w:t>
+              <w:t>education.</w:t>
             </w:r>
             <w:r>
               <w:rPr>
@@ -1966,6 +2136,47 @@
                 <w:sz w:val="20"/>
                 <w:lang w:val="it-IT"/>
               </w:rPr>
+              <w:t>trainingItems}}</w:t>
+            </w:r>
+          </w:p>
+          <w:p>
+            <w:pPr>
+              <w:pStyle w:val="OiaeaeiYiio2"/>
+              <w:widowControl/>
+              <w:spacing w:before="20" w:after="20"/>
+              <w:jc w:val="left"/>
+              <w:rPr>
+                <w:rFonts w:ascii="Arial Narrow" w:hAnsi="Arial Narrow" w:cs="Arial Narrow"/>
+                <w:i w:val="0"/>
+                <w:sz w:val="20"/>
+                <w:lang w:val="it-IT"/>
+              </w:rPr>
+            </w:pPr>
+            <w:r>
+              <w:rPr>
+                <w:rFonts w:ascii="Arial Narrow" w:hAnsi="Arial Narrow" w:cs="Arial Narrow"/>
+                <w:i w:val="0"/>
+                <w:sz w:val="20"/>
+                <w:lang w:val="it-IT"/>
+              </w:rPr>
+              <w:t>- {{</w:t>
+            </w:r>
+            <w:r>
+              <w:rPr>
+                <w:rFonts w:ascii="Arial Narrow" w:hAnsi="Arial Narrow" w:cs="Arial Narrow"/>
+                <w:i w:val="0"/>
+                <w:sz w:val="20"/>
+                <w:lang w:val="it-IT"/>
+              </w:rPr>
+              <w:t>text</w:t>
+            </w:r>
+            <w:r>
+              <w:rPr>
+                <w:rFonts w:ascii="Arial Narrow" w:hAnsi="Arial Narrow" w:cs="Arial Narrow"/>
+                <w:i w:val="0"/>
+                <w:sz w:val="20"/>
+                <w:lang w:val="it-IT"/>
+              </w:rPr>
               <w:t>}}</w:t>
             </w:r>
           </w:p>
@@ -1974,7 +2185,7 @@
               <w:pStyle w:val="OiaeaeiYiio2"/>
               <w:widowControl/>
               <w:spacing w:before="20" w:after="20"/>
-              <w:jc w:val="left"/>
+              <w:jc w:val="both"/>
               <w:rPr>
                 <w:rFonts w:ascii="Arial Narrow" w:hAnsi="Arial Narrow" w:cs="Arial Narrow"/>
                 <w:i w:val="0"/>
@@ -1989,22 +2200,17 @@
                 <w:sz w:val="20"/>
                 <w:lang w:val="it-IT"/>
               </w:rPr>
-              <w:t>{{#trainingItems}}</w:t>
-            </w:r>
-          </w:p>
-          <w:p>
-            <w:pPr>
-              <w:pStyle w:val="OiaeaeiYiio2"/>
-              <w:widowControl/>
-              <w:spacing w:before="20" w:after="20"/>
-              <w:jc w:val="left"/>
+              <w:t>{{/</w:t>
+            </w:r>
+            <w:r>
               <w:rPr>
                 <w:rFonts w:ascii="Arial Narrow" w:hAnsi="Arial Narrow" w:cs="Arial Narrow"/>
                 <w:i w:val="0"/>
                 <w:sz w:val="20"/>
                 <w:lang w:val="it-IT"/>
               </w:rPr>
-            </w:pPr>
+              <w:t>education.</w:t>
+            </w:r>
             <w:r>
               <w:rPr>
                 <w:rFonts w:ascii="Arial Narrow" w:hAnsi="Arial Narrow" w:cs="Arial Narrow"/>
@@ -2012,30 +2218,7 @@
                 <w:sz w:val="20"/>
                 <w:lang w:val="it-IT"/>
               </w:rPr>
-              <w:t>- {{.}}</w:t>
-            </w:r>
-          </w:p>
-          <w:p>
-            <w:pPr>
-              <w:pStyle w:val="OiaeaeiYiio2"/>
-              <w:widowControl/>
-              <w:spacing w:before="20" w:after="20"/>
-              <w:jc w:val="both"/>
-              <w:rPr>
-                <w:rFonts w:ascii="Arial Narrow" w:hAnsi="Arial Narrow" w:cs="Arial Narrow"/>
-                <w:i w:val="0"/>
-                <w:sz w:val="20"/>
-                <w:lang w:val="it-IT"/>
-              </w:rPr>
-            </w:pPr>
-            <w:r>
-              <w:rPr>
-                <w:rFonts w:ascii="Arial Narrow" w:hAnsi="Arial Narrow" w:cs="Arial Narrow"/>
-                <w:i w:val="0"/>
-                <w:sz w:val="20"/>
-                <w:lang w:val="it-IT"/>
-              </w:rPr>
-              <w:t>{{/trainingItems}}</w:t>
+              <w:t>trainingItems}}</w:t>
             </w:r>
           </w:p>
         </w:tc>
@@ -2060,80 +2243,52 @@
                 <w:lang w:val="it-IT"/>
               </w:rPr>
             </w:pPr>
-            <w:r>
+          </w:p>
+        </w:tc>
+        <w:tc>
+          <w:tcPr>
+            <w:tcW w:w="284" w:type="dxa"/>
+            <w:tcMar>
+              <w:top w:w="0" w:type="dxa"/>
+              <w:left w:w="108" w:type="dxa"/>
+              <w:bottom w:w="0" w:type="dxa"/>
+              <w:right w:w="108" w:type="dxa"/>
+            </w:tcMar>
+          </w:tcPr>
+          <w:p>
+            <w:pPr>
+              <w:pStyle w:val="Aaoeeu"/>
+              <w:widowControl/>
+              <w:snapToGrid w:val="0"/>
+              <w:spacing w:before="20" w:after="20"/>
+              <w:rPr>
+                <w:rFonts w:ascii="Arial Narrow" w:hAnsi="Arial Narrow" w:cs="Arial Narrow"/>
+                <w:lang w:val="it-IT"/>
+              </w:rPr>
+            </w:pPr>
+          </w:p>
+        </w:tc>
+        <w:tc>
+          <w:tcPr>
+            <w:tcW w:w="7229" w:type="dxa"/>
+            <w:tcMar>
+              <w:top w:w="0" w:type="dxa"/>
+              <w:left w:w="108" w:type="dxa"/>
+              <w:bottom w:w="0" w:type="dxa"/>
+              <w:right w:w="108" w:type="dxa"/>
+            </w:tcMar>
+          </w:tcPr>
+          <w:p>
+            <w:pPr>
+              <w:pStyle w:val="OiaeaeiYiio2"/>
+              <w:widowControl/>
+              <w:snapToGrid w:val="0"/>
+              <w:spacing w:before="20" w:after="20"/>
+              <w:jc w:val="left"/>
               <w:rPr>
                 <w:rFonts w:ascii="Arial Narrow" w:hAnsi="Arial Narrow" w:cs="Arial Narrow"/>
                 <w:i w:val="0"/>
                 <w:sz w:val="20"/>
-                <w:lang w:val="it-IT"/>
-              </w:rPr>
-              <w:t>•</w:t>
-            </w:r>
-            <w:r>
-              <w:rPr>
-                <w:rFonts w:ascii="Arial Narrow" w:eastAsia="Times New Roman" w:hAnsi="Arial Narrow" w:cs="Arial Narrow"/>
-                <w:i w:val="0"/>
-                <w:sz w:val="20"/>
-                <w:lang w:val="it-IT"/>
-              </w:rPr>
-              <w:t xml:space="preserve"> </w:t>
-            </w:r>
-            <w:r>
-              <w:rPr>
-                <w:rFonts w:ascii="Arial Narrow" w:hAnsi="Arial Narrow" w:cs="Arial Narrow"/>
-                <w:i w:val="0"/>
-                <w:sz w:val="20"/>
-                <w:lang w:val="it-IT"/>
-              </w:rPr>
-              <w:t>Nome e tipo di istituto di istruzione o formazione</w:t>
-            </w:r>
-          </w:p>
-        </w:tc>
-        <w:tc>
-          <w:tcPr>
-            <w:tcW w:w="284" w:type="dxa"/>
-            <w:tcMar>
-              <w:top w:w="0" w:type="dxa"/>
-              <w:left w:w="108" w:type="dxa"/>
-              <w:bottom w:w="0" w:type="dxa"/>
-              <w:right w:w="108" w:type="dxa"/>
-            </w:tcMar>
-          </w:tcPr>
-          <w:p>
-            <w:pPr>
-              <w:pStyle w:val="Aaoeeu"/>
-              <w:widowControl/>
-              <w:snapToGrid w:val="0"/>
-              <w:spacing w:before="20" w:after="20"/>
-              <w:rPr>
-                <w:rFonts w:ascii="Arial Narrow" w:hAnsi="Arial Narrow" w:cs="Arial Narrow"/>
-                <w:lang w:val="it-IT"/>
-              </w:rPr>
-            </w:pPr>
-          </w:p>
-        </w:tc>
-        <w:tc>
-          <w:tcPr>
-            <w:tcW w:w="7229" w:type="dxa"/>
-            <w:tcMar>
-              <w:top w:w="0" w:type="dxa"/>
-              <w:left w:w="108" w:type="dxa"/>
-              <w:bottom w:w="0" w:type="dxa"/>
-              <w:right w:w="108" w:type="dxa"/>
-            </w:tcMar>
-          </w:tcPr>
-          <w:p>
-            <w:pPr>
-              <w:pStyle w:val="OiaeaeiYiio2"/>
-              <w:widowControl/>
-              <w:snapToGrid w:val="0"/>
-              <w:spacing w:before="20" w:after="20"/>
-              <w:jc w:val="left"/>
-              <w:rPr>
-                <w:rFonts w:ascii="Arial Narrow" w:hAnsi="Arial Narrow" w:cs="Arial Narrow"/>
-                <w:i w:val="0"/>
-                <w:sz w:val="20"/>
-                <w:u w:val="single"/>
                 <w:lang w:val="it-IT"/>
               </w:rPr>
             </w:pPr>
@@ -2154,39 +2309,73 @@
           <w:p>
             <w:pPr>
               <w:pStyle w:val="OiaeaeiYiio2"/>
-              <w:widowControl/>
-              <w:spacing w:before="20" w:after="20"/>
-              <w:rPr>
-                <w:lang w:val="it-IT"/>
-              </w:rPr>
-            </w:pPr>
-            <w:r>
-              <w:rPr>
-                <w:rFonts w:ascii="Arial Narrow" w:hAnsi="Arial Narrow" w:cs="Arial Narrow"/>
+              <w:spacing w:before="20" w:after="20"/>
+              <w:rPr>
+                <w:rFonts w:ascii="Arial Narrow" w:hAnsi="Arial Narrow"/>
                 <w:i w:val="0"/>
                 <w:sz w:val="20"/>
-                <w:lang w:val="it-IT"/>
-              </w:rPr>
-              <w:t>•</w:t>
-            </w:r>
-            <w:r>
-              <w:rPr>
-                <w:rFonts w:ascii="Arial Narrow" w:eastAsia="Times New Roman" w:hAnsi="Arial Narrow" w:cs="Arial Narrow"/>
+                <w:lang w:val="it-CH"/>
+              </w:rPr>
+            </w:pPr>
+            <w:r>
+              <w:rPr>
+                <w:rFonts w:ascii="Arial Narrow" w:hAnsi="Arial Narrow"/>
                 <w:i w:val="0"/>
                 <w:sz w:val="20"/>
-                <w:lang w:val="it-IT"/>
-              </w:rPr>
-              <w:t xml:space="preserve"> </w:t>
-            </w:r>
-            <w:r>
-              <w:rPr>
-                <w:rFonts w:ascii="Arial Narrow" w:hAnsi="Arial Narrow" w:cs="Arial Narrow"/>
+                <w:lang w:val="it-CH"/>
+              </w:rPr>
+              <w:t>{{education.</w:t>
+            </w:r>
+            <w:r>
+              <w:rPr>
+                <w:rFonts w:ascii="Arial Narrow" w:hAnsi="Arial Narrow"/>
                 <w:i w:val="0"/>
                 <w:sz w:val="20"/>
-                <w:lang w:val="it-IT"/>
-              </w:rPr>
-              <w:t>Principali materie / abilità professionali oggetto dello studio</w:t>
-            </w:r>
+                <w:lang w:val="it-CH"/>
+              </w:rPr>
+              <w:t>scholarshi</w:t>
+            </w:r>
+            <w:r>
+              <w:rPr>
+                <w:rFonts w:ascii="Arial Narrow" w:hAnsi="Arial Narrow"/>
+                <w:i w:val="0"/>
+                <w:sz w:val="20"/>
+                <w:lang w:val="it-CH"/>
+              </w:rPr>
+              <w:t>p</w:t>
+            </w:r>
+            <w:r>
+              <w:rPr>
+                <w:rFonts w:ascii="Arial Narrow" w:hAnsi="Arial Narrow"/>
+                <w:i w:val="0"/>
+                <w:sz w:val="20"/>
+                <w:lang w:val="it-CH"/>
+              </w:rPr>
+              <w:t>Title</w:t>
+            </w:r>
+            <w:r>
+              <w:rPr>
+                <w:rFonts w:ascii="Arial Narrow" w:hAnsi="Arial Narrow"/>
+                <w:i w:val="0"/>
+                <w:sz w:val="20"/>
+                <w:lang w:val="it-CH"/>
+              </w:rPr>
+              <w:t>}}</w:t>
+            </w:r>
+          </w:p>
+          <w:p>
+            <w:pPr>
+              <w:pStyle w:val="OiaeaeiYiio2"/>
+              <w:widowControl/>
+              <w:spacing w:before="20" w:after="20"/>
+              <w:rPr>
+                <w:rFonts w:ascii="Arial Narrow" w:hAnsi="Arial Narrow"/>
+                <w:i w:val="0"/>
+                <w:iCs/>
+                <w:sz w:val="20"/>
+                <w:lang w:val="it-IT"/>
+              </w:rPr>
+            </w:pPr>
           </w:p>
         </w:tc>
         <w:tc>
@@ -2236,6 +2425,159 @@
                 <w:lang w:val="it-IT"/>
               </w:rPr>
             </w:pPr>
+            <w:r>
+              <w:rPr>
+                <w:rFonts w:ascii="Arial Narrow" w:hAnsi="Arial Narrow" w:cs="Arial Narrow"/>
+                <w:i w:val="0"/>
+                <w:sz w:val="20"/>
+                <w:lang w:val="it-IT"/>
+              </w:rPr>
+              <w:t>{{education.</w:t>
+            </w:r>
+            <w:r>
+              <w:rPr>
+                <w:rFonts w:ascii="Arial Narrow" w:hAnsi="Arial Narrow" w:cs="Arial Narrow"/>
+                <w:i w:val="0"/>
+                <w:sz w:val="20"/>
+                <w:lang w:val="it-IT"/>
+              </w:rPr>
+              <w:t>scholarshipDescription</w:t>
+            </w:r>
+            <w:r>
+              <w:rPr>
+                <w:rFonts w:ascii="Arial Narrow" w:hAnsi="Arial Narrow" w:cs="Arial Narrow"/>
+                <w:i w:val="0"/>
+                <w:sz w:val="20"/>
+                <w:lang w:val="it-IT"/>
+              </w:rPr>
+              <w:t>}}</w:t>
+            </w:r>
+          </w:p>
+          <w:p>
+            <w:pPr>
+              <w:pStyle w:val="OiaeaeiYiio2"/>
+              <w:widowControl/>
+              <w:snapToGrid w:val="0"/>
+              <w:spacing w:before="20" w:after="20"/>
+              <w:jc w:val="left"/>
+              <w:rPr>
+                <w:rFonts w:ascii="Arial Narrow" w:hAnsi="Arial Narrow" w:cs="Arial Narrow"/>
+                <w:i w:val="0"/>
+                <w:sz w:val="20"/>
+                <w:lang w:val="it-IT"/>
+              </w:rPr>
+            </w:pPr>
+            <w:r>
+              <w:rPr>
+                <w:rFonts w:ascii="Arial Narrow" w:hAnsi="Arial Narrow" w:cs="Arial Narrow"/>
+                <w:i w:val="0"/>
+                <w:sz w:val="20"/>
+                <w:lang w:val="it-IT"/>
+              </w:rPr>
+              <w:t>{{#education.</w:t>
+            </w:r>
+            <w:r>
+              <w:rPr>
+                <w:rFonts w:ascii="Arial Narrow" w:hAnsi="Arial Narrow" w:cs="Arial Narrow"/>
+                <w:i w:val="0"/>
+                <w:sz w:val="20"/>
+                <w:lang w:val="it-IT"/>
+              </w:rPr>
+              <w:t>scholarshipItems</w:t>
+            </w:r>
+            <w:r>
+              <w:rPr>
+                <w:rFonts w:ascii="Arial Narrow" w:hAnsi="Arial Narrow" w:cs="Arial Narrow"/>
+                <w:i w:val="0"/>
+                <w:sz w:val="20"/>
+                <w:lang w:val="it-IT"/>
+              </w:rPr>
+              <w:t>}}</w:t>
+            </w:r>
+          </w:p>
+          <w:p>
+            <w:pPr>
+              <w:pStyle w:val="OiaeaeiYiio2"/>
+              <w:widowControl/>
+              <w:snapToGrid w:val="0"/>
+              <w:spacing w:before="20" w:after="20"/>
+              <w:jc w:val="left"/>
+              <w:rPr>
+                <w:rFonts w:ascii="Arial Narrow" w:hAnsi="Arial Narrow" w:cs="Arial Narrow"/>
+                <w:i w:val="0"/>
+                <w:sz w:val="20"/>
+                <w:lang w:val="it-IT"/>
+              </w:rPr>
+            </w:pPr>
+            <w:r>
+              <w:rPr>
+                <w:rFonts w:ascii="Arial Narrow" w:hAnsi="Arial Narrow" w:cs="Arial Narrow"/>
+                <w:i w:val="0"/>
+                <w:sz w:val="20"/>
+                <w:lang w:val="it-IT"/>
+              </w:rPr>
+              <w:t>-{{text}}</w:t>
+            </w:r>
+          </w:p>
+          <w:p>
+            <w:pPr>
+              <w:pStyle w:val="OiaeaeiYiio2"/>
+              <w:widowControl/>
+              <w:snapToGrid w:val="0"/>
+              <w:spacing w:before="20" w:after="20"/>
+              <w:jc w:val="left"/>
+              <w:rPr>
+                <w:rFonts w:ascii="Arial Narrow" w:hAnsi="Arial Narrow" w:cs="Arial Narrow"/>
+                <w:i w:val="0"/>
+                <w:sz w:val="20"/>
+                <w:lang w:val="it-IT"/>
+              </w:rPr>
+            </w:pPr>
+            <w:r>
+              <w:rPr>
+                <w:rFonts w:ascii="Arial Narrow" w:hAnsi="Arial Narrow" w:cs="Arial Narrow"/>
+                <w:i w:val="0"/>
+                <w:sz w:val="20"/>
+                <w:lang w:val="it-IT"/>
+              </w:rPr>
+              <w:t>{{</w:t>
+            </w:r>
+            <w:r>
+              <w:rPr>
+                <w:rFonts w:ascii="Arial Narrow" w:hAnsi="Arial Narrow" w:cs="Arial Narrow"/>
+                <w:i w:val="0"/>
+                <w:sz w:val="20"/>
+                <w:lang w:val="it-IT"/>
+              </w:rPr>
+              <w:t>/</w:t>
+            </w:r>
+            <w:r>
+              <w:rPr>
+                <w:rFonts w:ascii="Arial Narrow" w:hAnsi="Arial Narrow" w:cs="Arial Narrow"/>
+                <w:i w:val="0"/>
+                <w:sz w:val="20"/>
+                <w:lang w:val="it-IT"/>
+              </w:rPr>
+              <w:t>education.</w:t>
+            </w:r>
+            <w:r>
+              <w:rPr>
+                <w:rFonts w:ascii="Arial Narrow" w:hAnsi="Arial Narrow" w:cs="Arial Narrow"/>
+                <w:i w:val="0"/>
+                <w:sz w:val="20"/>
+                <w:lang w:val="it-IT"/>
+              </w:rPr>
+              <w:t>scholarshipItems</w:t>
+            </w:r>
+            <w:r>
+              <w:rPr>
+                <w:rFonts w:ascii="Arial Narrow" w:hAnsi="Arial Narrow" w:cs="Arial Narrow"/>
+                <w:i w:val="0"/>
+                <w:sz w:val="20"/>
+                <w:lang w:val="it-IT"/>
+              </w:rPr>
+              <w:t>}}</w:t>
+            </w:r>
           </w:p>
         </w:tc>
       </w:tr>
@@ -2255,34 +2597,8 @@
               <w:pStyle w:val="OiaeaeiYiio2"/>
               <w:widowControl/>
               <w:spacing w:before="20" w:after="20"/>
-            </w:pPr>
-            <w:r>
-              <w:rPr>
-                <w:rFonts w:ascii="Arial Narrow" w:hAnsi="Arial Narrow" w:cs="Arial Narrow"/>
-                <w:i w:val="0"/>
-                <w:sz w:val="20"/>
-                <w:lang w:val="it-IT"/>
-              </w:rPr>
-              <w:t>•</w:t>
-            </w:r>
-            <w:r>
-              <w:rPr>
-                <w:rFonts w:ascii="Arial Narrow" w:eastAsia="Times New Roman" w:hAnsi="Arial Narrow" w:cs="Arial Narrow"/>
-                <w:i w:val="0"/>
-                <w:sz w:val="20"/>
-                <w:lang w:val="it-IT"/>
-              </w:rPr>
-              <w:t xml:space="preserve"> </w:t>
-            </w:r>
-            <w:r>
-              <w:rPr>
-                <w:rFonts w:ascii="Arial Narrow" w:hAnsi="Arial Narrow" w:cs="Arial Narrow"/>
-                <w:i w:val="0"/>
-                <w:sz w:val="20"/>
-                <w:lang w:val="it-IT"/>
-              </w:rPr>
-              <w:t>Qualifica conseguita</w:t>
-            </w:r>
+              <w:jc w:val="left"/>
+            </w:pPr>
           </w:p>
         </w:tc>
         <w:tc>
@@ -2351,45 +2667,11 @@
               <w:pStyle w:val="OiaeaeiYiio2"/>
               <w:widowControl/>
               <w:spacing w:before="20" w:after="20"/>
-              <w:rPr>
-                <w:lang w:val="it-IT"/>
-              </w:rPr>
-            </w:pPr>
-            <w:r>
-              <w:rPr>
-                <w:rFonts w:ascii="Arial Narrow" w:hAnsi="Arial Narrow" w:cs="Arial Narrow"/>
-                <w:i w:val="0"/>
-                <w:sz w:val="20"/>
-                <w:lang w:val="it-IT"/>
-              </w:rPr>
-              <w:t>•</w:t>
-            </w:r>
-            <w:r>
-              <w:rPr>
-                <w:rFonts w:ascii="Arial Narrow" w:eastAsia="Times New Roman" w:hAnsi="Arial Narrow" w:cs="Arial Narrow"/>
-                <w:i w:val="0"/>
-                <w:sz w:val="20"/>
-                <w:lang w:val="it-IT"/>
-              </w:rPr>
-              <w:t xml:space="preserve"> </w:t>
-            </w:r>
-            <w:r>
-              <w:rPr>
-                <w:rFonts w:ascii="Arial Narrow" w:hAnsi="Arial Narrow" w:cs="Arial Narrow"/>
-                <w:i w:val="0"/>
-                <w:sz w:val="20"/>
-                <w:lang w:val="it-IT"/>
-              </w:rPr>
-              <w:t>Livello nella classificazione nazionale (se pertinente</w:t>
-            </w:r>
-            <w:r>
-              <w:rPr>
-                <w:rFonts w:ascii="Arial Narrow" w:hAnsi="Arial Narrow" w:cs="Arial Narrow"/>
-                <w:i w:val="0"/>
-                <w:lang w:val="it-IT"/>
-              </w:rPr>
-              <w:t>)</w:t>
-            </w:r>
+              <w:jc w:val="left"/>
+              <w:rPr>
+                <w:lang w:val="it-IT"/>
+              </w:rPr>
+            </w:pPr>
           </w:p>
         </w:tc>
         <w:tc>
@@ -2448,76 +2730,6 @@
         <w:pStyle w:val="Standard"/>
         <w:pageBreakBefore/>
       </w:pPr>
-      <w:r>
-        <w:rPr>
-          <w:noProof/>
-        </w:rPr>
-        <w:lastRenderedPageBreak/>
-        <mc:AlternateContent>
-          <mc:Choice Requires="wps">
-            <w:drawing>
-              <wp:anchor distT="0" distB="0" distL="114300" distR="114300" simplePos="0" relativeHeight="251660288" behindDoc="0" locked="0" layoutInCell="1" allowOverlap="1" wp14:anchorId="08E9487C" wp14:editId="6F964955">
-                <wp:simplePos x="0" y="0"/>
-                <wp:positionH relativeFrom="page">
-                  <wp:posOffset>2352675</wp:posOffset>
-                </wp:positionH>
-                <wp:positionV relativeFrom="margin">
-                  <wp:align>bottom</wp:align>
-                </wp:positionV>
-                <wp:extent cx="19050" cy="9391650"/>
-                <wp:effectExtent l="19050" t="19050" r="38100" b="38100"/>
-                <wp:wrapNone/>
-                <wp:docPr id="4" name="Connettore 2 2"/>
-                <wp:cNvGraphicFramePr>
-                  <a:graphicFrameLocks xmlns:a="http://schemas.openxmlformats.org/drawingml/2006/main"/>
-                </wp:cNvGraphicFramePr>
-                <a:graphic xmlns:a="http://schemas.openxmlformats.org/drawingml/2006/main">
-                  <a:graphicData uri="http://schemas.microsoft.com/office/word/2010/wordprocessingShape">
-                    <wps:wsp>
-                      <wps:cNvCnPr>
-                        <a:cxnSpLocks/>
-                      </wps:cNvCnPr>
-                      <wps:spPr>
-                        <a:xfrm flipH="1">
-                          <a:off x="0" y="0"/>
-                          <a:ext cx="19050" cy="9391650"/>
-                        </a:xfrm>
-                        <a:prstGeom prst="straightConnector1">
-                          <a:avLst/>
-                        </a:prstGeom>
-                        <a:noFill/>
-                        <a:ln w="9363" cap="sq">
-                          <a:solidFill>
-                            <a:srgbClr val="000000"/>
-                          </a:solidFill>
-                          <a:prstDash val="solid"/>
-                          <a:miter/>
-                        </a:ln>
-                      </wps:spPr>
-                      <wps:bodyPr/>
-                    </wps:wsp>
-                  </a:graphicData>
-                </a:graphic>
-                <wp14:sizeRelH relativeFrom="page">
-                  <wp14:pctWidth>0</wp14:pctWidth>
-                </wp14:sizeRelH>
-                <wp14:sizeRelV relativeFrom="page">
-                  <wp14:pctHeight>0</wp14:pctHeight>
-                </wp14:sizeRelV>
-              </wp:anchor>
-            </w:drawing>
-          </mc:Choice>
-          <mc:Fallback>
-            <w:pict>
-              <v:shape w14:anchorId="1D5FD26B" id="Connettore 2 2" o:spid="_x0000_s1026" type="#_x0000_t32" style="position:absolute;margin-left:185.25pt;margin-top:0;width:1.5pt;height:739.5pt;flip:x;z-index:251660288;visibility:visible;mso-wrap-style:square;mso-width-percent:0;mso-height-percent:0;mso-wrap-distance-left:9pt;mso-wrap-distance-top:0;mso-wrap-distance-right:9pt;mso-wrap-distance-bottom:0;mso-position-horizontal:absolute;mso-position-horizontal-relative:page;mso-position-vertical:bottom;mso-position-vertical-relative:margin;mso-width-percent:0;mso-height-percent:0;mso-width-relative:page;mso-height-relative:page" o:gfxdata="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" strokeweight=".26008mm">
-                <v:stroke joinstyle="miter" endcap="square"/>
-                <o:lock v:ext="edit" shapetype="f"/>
-                <w10:wrap anchorx="page" anchory="margin"/>
-              </v:shape>
-            </w:pict>
-          </mc:Fallback>
-        </mc:AlternateContent>
-      </w:r>
     </w:p>
     <w:tbl>
       <w:tblPr>
@@ -3377,6 +3589,54 @@
           <w:lang w:val="it-IT"/>
         </w:rPr>
       </w:pPr>
+      <w:r>
+        <w:rPr>
+          <w:rFonts w:ascii="Arial Narrow" w:hAnsi="Arial Narrow" w:cs="Arial Narrow"/>
+          <w:noProof/>
+          <w:lang w:val="it-IT"/>
+          <w14:ligatures w14:val="standardContextual"/>
+        </w:rPr>
+        <mc:AlternateContent>
+          <mc:Choice Requires="wpi">
+            <w:drawing>
+              <wp:anchor distT="0" distB="0" distL="114300" distR="114300" simplePos="0" relativeHeight="251664384" behindDoc="0" locked="0" layoutInCell="1" allowOverlap="1" wp14:anchorId="47889886" wp14:editId="3894B954">
+                <wp:simplePos x="0" y="0"/>
+                <wp:positionH relativeFrom="column">
+                  <wp:posOffset>1869743</wp:posOffset>
+                </wp:positionH>
+                <wp:positionV relativeFrom="paragraph">
+                  <wp:posOffset>-4050201</wp:posOffset>
+                </wp:positionV>
+                <wp:extent cx="360" cy="10071000"/>
+                <wp:effectExtent l="57150" t="57150" r="57150" b="45085"/>
+                <wp:wrapNone/>
+                <wp:docPr id="1721710256" name="Input penna 7"/>
+                <wp:cNvGraphicFramePr/>
+                <a:graphic xmlns:a="http://schemas.openxmlformats.org/drawingml/2006/main">
+                  <a:graphicData uri="http://schemas.microsoft.com/office/word/2010/wordprocessingInk">
+                    <w14:contentPart bwMode="auto" r:id="rId12">
+                      <w14:nvContentPartPr>
+                        <w14:cNvContentPartPr/>
+                      </w14:nvContentPartPr>
+                      <w14:xfrm>
+                        <a:off x="0" y="0"/>
+                        <a:ext cx="360" cy="10071000"/>
+                      </w14:xfrm>
+                    </w14:contentPart>
+                  </a:graphicData>
+                </a:graphic>
+              </wp:anchor>
+            </w:drawing>
+          </mc:Choice>
+          <mc:Fallback>
+            <w:pict>
+              <v:shape w14:anchorId="7513470D" id="Input penna 7" o:spid="_x0000_s1026" type="#_x0000_t75" style="position:absolute;margin-left:146.5pt;margin-top:-319.6pt;width:1.45pt;height:794.45pt;z-index:251664384;visibility:visible;mso-wrap-style:square;mso-wrap-distance-left:9pt;mso-wrap-distance-top:0;mso-wrap-distance-right:9pt;mso-wrap-distance-bottom:0;mso-position-horizontal:absolute;mso-position-horizontal-relative:text;mso-position-vertical:absolute;mso-position-vertical-relative:text" o:gfxdata="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">
+                <v:imagedata r:id="rId9" o:title=""/>
+              </v:shape>
+            </w:pict>
+          </mc:Fallback>
+        </mc:AlternateContent>
+      </w:r>
     </w:p>
     <w:tbl>
       <w:tblPr>
@@ -4342,9 +4602,9 @@
     </w:p>
     <w:p/>
     <w:sectPr>
-      <w:footerReference w:type="default" r:id="rId8"/>
+      <w:footerReference w:type="default" r:id="rId13"/>
       <w:pgSz w:w="11906" w:h="16838"/>
-      <w:pgMar w:top="567" w:right="1134" w:bottom="567" w:left="567" w:header="720" w:footer="454" w:gutter="0"/>
+      <w:pgMar w:top="567" w:right="1134" w:bottom="284" w:left="567" w:header="720" w:footer="454" w:gutter="0"/>
       <w:cols w:space="720"/>
     </w:sectPr>
   </w:body>
@@ -4375,214 +4635,57 @@
   <w:p>
     <w:pPr>
       <w:pStyle w:val="Pidipagina"/>
-    </w:pPr>
-    <w:r>
       <w:rPr>
-        <w:noProof/>
-      </w:rPr>
-      <mc:AlternateContent>
-        <mc:Choice Requires="wps">
-          <w:drawing>
-            <wp:anchor distT="0" distB="0" distL="114300" distR="114300" simplePos="0" relativeHeight="251659264" behindDoc="0" locked="0" layoutInCell="1" allowOverlap="1" wp14:anchorId="7A30C9C0" wp14:editId="4146BD9E">
-              <wp:simplePos x="0" y="0"/>
-              <wp:positionH relativeFrom="margin">
-                <wp:posOffset>-13970</wp:posOffset>
-              </wp:positionH>
-              <wp:positionV relativeFrom="paragraph">
-                <wp:posOffset>635</wp:posOffset>
-              </wp:positionV>
-              <wp:extent cx="57785" cy="146050"/>
-              <wp:effectExtent l="0" t="0" r="18415" b="6350"/>
-              <wp:wrapSquare wrapText="bothSides"/>
-              <wp:docPr id="1249300547" name="Casella di testo 5"/>
-              <wp:cNvGraphicFramePr>
-                <a:graphicFrameLocks xmlns:a="http://schemas.openxmlformats.org/drawingml/2006/main"/>
-              </wp:cNvGraphicFramePr>
-              <a:graphic xmlns:a="http://schemas.openxmlformats.org/drawingml/2006/main">
-                <a:graphicData uri="http://schemas.microsoft.com/office/word/2010/wordprocessingShape">
-                  <wps:wsp>
-                    <wps:cNvSpPr txBox="1">
-                      <a:spLocks/>
-                    </wps:cNvSpPr>
-                    <wps:spPr>
-                      <a:xfrm>
-                        <a:off x="0" y="0"/>
-                        <a:ext cx="57785" cy="146050"/>
-                      </a:xfrm>
-                      <a:prstGeom prst="rect">
-                        <a:avLst/>
-                      </a:prstGeom>
-                      <a:noFill/>
-                      <a:ln>
-                        <a:noFill/>
-                        <a:prstDash/>
-                      </a:ln>
-                    </wps:spPr>
-                    <wps:txbx>
-                      <w:txbxContent>
-                        <w:p>
-                          <w:pPr>
-                            <w:pStyle w:val="Pidipagina"/>
-                          </w:pPr>
-                        </w:p>
-                      </w:txbxContent>
-                    </wps:txbx>
-                    <wps:bodyPr vert="horz" wrap="none" lIns="0" tIns="0" rIns="0" bIns="0" anchor="t" anchorCtr="0" compatLnSpc="0">
-                      <a:noAutofit/>
-                    </wps:bodyPr>
-                  </wps:wsp>
-                </a:graphicData>
-              </a:graphic>
-              <wp14:sizeRelH relativeFrom="page">
-                <wp14:pctWidth>0</wp14:pctWidth>
-              </wp14:sizeRelH>
-              <wp14:sizeRelV relativeFrom="page">
-                <wp14:pctHeight>0</wp14:pctHeight>
-              </wp14:sizeRelV>
-            </wp:anchor>
-          </w:drawing>
-        </mc:Choice>
-        <mc:Fallback>
-          <w:pict>
-            <v:shapetype w14:anchorId="7A30C9C0" id="_x0000_t202" coordsize="21600,21600" o:spt="202" path="m,l,21600r21600,l21600,xe">
-              <v:stroke joinstyle="miter"/>
-              <v:path gradientshapeok="t" o:connecttype="rect"/>
-            </v:shapetype>
-            <v:shape id="Casella di testo 5" o:spid="_x0000_s1026" type="#_x0000_t202" style="position:absolute;margin-left:-1.1pt;margin-top:.05pt;width:4.55pt;height:11.5pt;z-index:251659264;visibility:visible;mso-wrap-style:none;mso-width-percent:0;mso-height-percent:0;mso-wrap-distance-left:9pt;mso-wrap-distance-top:0;mso-wrap-distance-right:9pt;mso-wrap-distance-bottom:0;mso-position-horizontal:absolute;mso-position-horizontal-relative:margin;mso-position-vertical:absolute;mso-position-vertical-relative:text;mso-width-percent:0;mso-height-percent:0;mso-width-relative:page;mso-height-relative:page;v-text-anchor:top" o:gfxdata="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" filled="f" stroked="f">
-              <v:textbox inset="0,0,0,0">
-                <w:txbxContent>
-                  <w:p>
-                    <w:pPr>
-                      <w:pStyle w:val="Pidipagina"/>
-                    </w:pPr>
-                  </w:p>
-                </w:txbxContent>
-              </v:textbox>
-              <w10:wrap type="square" anchorx="margin"/>
-            </v:shape>
-          </w:pict>
-        </mc:Fallback>
-      </mc:AlternateContent>
-    </w:r>
-  </w:p>
-  <w:tbl>
-    <w:tblPr>
-      <w:tblW w:w="9322" w:type="dxa"/>
-      <w:tblInd w:w="-108" w:type="dxa"/>
-      <w:tblLayout w:type="fixed"/>
-      <w:tblCellMar>
-        <w:left w:w="10" w:type="dxa"/>
-        <w:right w:w="10" w:type="dxa"/>
-      </w:tblCellMar>
-      <w:tblLook w:val="0000" w:firstRow="0" w:lastRow="0" w:firstColumn="0" w:lastColumn="0" w:noHBand="0" w:noVBand="0"/>
-    </w:tblPr>
-    <w:tblGrid>
-      <w:gridCol w:w="2943"/>
-      <w:gridCol w:w="284"/>
-      <w:gridCol w:w="6095"/>
-    </w:tblGrid>
-    <w:tr>
-      <w:tc>
-        <w:tcPr>
-          <w:tcW w:w="2943" w:type="dxa"/>
-          <w:tcMar>
-            <w:top w:w="0" w:type="dxa"/>
-            <w:left w:w="108" w:type="dxa"/>
-            <w:bottom w:w="0" w:type="dxa"/>
-            <w:right w:w="108" w:type="dxa"/>
-          </w:tcMar>
-        </w:tcPr>
-        <w:p>
-          <w:pPr>
-            <w:pStyle w:val="Aaoeeu"/>
-            <w:widowControl/>
-            <w:tabs>
-              <w:tab w:val="left" w:pos="3261"/>
-            </w:tabs>
-            <w:snapToGrid w:val="0"/>
-            <w:jc w:val="right"/>
-            <w:rPr>
-              <w:rFonts w:ascii="Arial Narrow" w:hAnsi="Arial Narrow" w:cs="Arial Narrow"/>
-              <w:i/>
-              <w:sz w:val="16"/>
-              <w:lang w:val="it-IT"/>
-            </w:rPr>
-          </w:pPr>
-        </w:p>
-      </w:tc>
-      <w:tc>
-        <w:tcPr>
-          <w:tcW w:w="284" w:type="dxa"/>
-          <w:tcMar>
-            <w:top w:w="0" w:type="dxa"/>
-            <w:left w:w="108" w:type="dxa"/>
-            <w:bottom w:w="0" w:type="dxa"/>
-            <w:right w:w="108" w:type="dxa"/>
-          </w:tcMar>
-        </w:tcPr>
-        <w:p>
-          <w:pPr>
-            <w:pStyle w:val="Aaoeeu"/>
-            <w:widowControl/>
-            <w:tabs>
-              <w:tab w:val="left" w:pos="3261"/>
-            </w:tabs>
-            <w:snapToGrid w:val="0"/>
-            <w:rPr>
-              <w:rFonts w:ascii="Arial Narrow" w:hAnsi="Arial Narrow" w:cs="Arial Narrow"/>
-              <w:i/>
-              <w:sz w:val="16"/>
-              <w:lang w:val="it-IT"/>
-            </w:rPr>
-          </w:pPr>
-        </w:p>
-      </w:tc>
-      <w:tc>
-        <w:tcPr>
-          <w:tcW w:w="6095" w:type="dxa"/>
-          <w:tcMar>
-            <w:top w:w="0" w:type="dxa"/>
-            <w:left w:w="108" w:type="dxa"/>
-            <w:bottom w:w="0" w:type="dxa"/>
-            <w:right w:w="108" w:type="dxa"/>
-          </w:tcMar>
-        </w:tcPr>
-        <w:p>
-          <w:pPr>
-            <w:pStyle w:val="Aaoeeu"/>
-            <w:widowControl/>
-            <w:tabs>
-              <w:tab w:val="left" w:pos="3261"/>
-            </w:tabs>
-            <w:snapToGrid w:val="0"/>
-            <w:rPr>
-              <w:rFonts w:ascii="Arial Narrow" w:hAnsi="Arial Narrow" w:cs="Arial Narrow"/>
-              <w:sz w:val="16"/>
-              <w:lang w:val="it-IT"/>
-            </w:rPr>
-          </w:pPr>
-        </w:p>
-      </w:tc>
-    </w:tr>
-  </w:tbl>
-  <w:p>
-    <w:pPr>
-      <w:pStyle w:val="Aaoeeu"/>
-      <w:widowControl/>
-      <w:tabs>
-        <w:tab w:val="left" w:pos="3261"/>
-      </w:tabs>
-      <w:rPr>
-        <w:rFonts w:ascii="Arial Narrow" w:hAnsi="Arial Narrow" w:cs="Arial Narrow"/>
-        <w:sz w:val="18"/>
+        <w:szCs w:val="14"/>
       </w:rPr>
     </w:pPr>
     <w:r>
       <w:rPr>
         <w:rFonts w:ascii="Arial Narrow" w:hAnsi="Arial Narrow" w:cs="Arial Narrow"/>
-        <w:sz w:val="18"/>
+        <w:smallCaps/>
+        <w:spacing w:val="40"/>
+        <w:sz w:val="24"/>
+        <w:szCs w:val="18"/>
       </w:rPr>
-      <w:tab/>
+      <w:t>curriculum</w:t>
+    </w:r>
+    <w:r>
+      <w:rPr>
+        <w:rFonts w:ascii="Arial Narrow" w:hAnsi="Arial Narrow" w:cs="Arial Narrow"/>
+        <w:smallCaps/>
+        <w:spacing w:val="40"/>
+        <w:sz w:val="24"/>
+        <w:szCs w:val="18"/>
+      </w:rPr>
+      <w:t xml:space="preserve"> generato automaticamente tramite protocollo JavaScript</w:t>
+    </w:r>
+    <w:r>
+      <w:rPr>
+        <w:rFonts w:ascii="Arial Narrow" w:hAnsi="Arial Narrow" w:cs="Arial Narrow"/>
+        <w:smallCaps/>
+        <w:spacing w:val="40"/>
+        <w:sz w:val="24"/>
+        <w:szCs w:val="18"/>
+      </w:rPr>
+      <w:t xml:space="preserve"> dal Portfolio original.</w:t>
+    </w:r>
+    <w:r>
+      <w:rPr>
+        <w:rFonts w:ascii="Arial Narrow" w:hAnsi="Arial Narrow" w:cs="Arial Narrow"/>
+        <w:smallCaps/>
+        <w:spacing w:val="40"/>
+        <w:szCs w:val="14"/>
+      </w:rPr>
+      <w:t xml:space="preserve"> </w:t>
+    </w:r>
+    <w:r>
+      <w:rPr>
+        <w:rFonts w:ascii="Arial Narrow" w:hAnsi="Arial Narrow" w:cs="Arial Narrow"/>
+        <w:smallCaps/>
+        <w:spacing w:val="40"/>
+        <w:szCs w:val="14"/>
+      </w:rPr>
+      <w:t>{{footer.text}}</w:t>
     </w:r>
   </w:p>
 </w:ftr>
@@ -5025,7 +5128,6 @@
   <w:style w:type="character" w:default="1" w:styleId="Carpredefinitoparagrafo">
     <w:name w:val="Default Paragraph Font"/>
     <w:uiPriority w:val="1"/>
-    <w:semiHidden/>
     <w:unhideWhenUsed/>
   </w:style>
   <w:style w:type="table" w:default="1" w:styleId="Tabellanormale">
@@ -5260,7 +5362,105 @@
       <w14:ligatures w14:val="none"/>
     </w:rPr>
   </w:style>
+  <w:style w:type="paragraph" w:styleId="Nessunaspaziatura">
+    <w:name w:val="No Spacing"/>
+    <w:uiPriority w:val="1"/>
+    <w:qFormat/>
+    <w:rsid w:val="00DF33B4"/>
+    <w:pPr>
+      <w:widowControl w:val="0"/>
+      <w:suppressAutoHyphens/>
+      <w:autoSpaceDN w:val="0"/>
+      <w:spacing w:after="0" w:line="240" w:lineRule="auto"/>
+      <w:textAlignment w:val="baseline"/>
+    </w:pPr>
+    <w:rPr>
+      <w:rFonts w:ascii="Liberation Serif" w:eastAsia="NSimSun" w:hAnsi="Liberation Serif" w:cs="Mangal"/>
+      <w:kern w:val="3"/>
+      <w:szCs w:val="21"/>
+      <w:lang w:val="it-IT" w:eastAsia="zh-CN" w:bidi="hi-IN"/>
+      <w14:ligatures w14:val="none"/>
+    </w:rPr>
+  </w:style>
 </w:styles>
+</file>
+
+<file path=word/ink/ink1.xml><?xml version="1.0" encoding="utf-8"?>
+<inkml:ink xmlns:inkml="http://www.w3.org/2003/InkML">
+  <inkml:definitions>
+    <inkml:context xml:id="ctx0">
+      <inkml:inkSource xml:id="inkSrc0">
+        <inkml:traceFormat>
+          <inkml:channel name="X" type="integer" min="-2.14748E9" max="2.14748E9" units="cm"/>
+          <inkml:channel name="Y" type="integer" min="-2.14748E9" max="2.14748E9" units="cm"/>
+        </inkml:traceFormat>
+        <inkml:channelProperties>
+          <inkml:channelProperty channel="X" name="resolution" value="1000" units="1/cm"/>
+          <inkml:channelProperty channel="Y" name="resolution" value="1000" units="1/cm"/>
+        </inkml:channelProperties>
+      </inkml:inkSource>
+      <inkml:timestamp xml:id="ts0" timeString="2026-06-12T15:02:25.506"/>
+    </inkml:context>
+    <inkml:brush xml:id="br0">
+      <inkml:brushProperty name="width" value="0.05" units="cm"/>
+      <inkml:brushProperty name="height" value="0.05" units="cm"/>
+      <inkml:brushProperty name="ignorePressure" value="1"/>
+    </inkml:brush>
+  </inkml:definitions>
+  <inkml:trace contextRef="#ctx0" brushRef="#br0">1 1,'0'27945,"0"-27916</inkml:trace>
+</inkml:ink>
+</file>
+
+<file path=word/ink/ink2.xml><?xml version="1.0" encoding="utf-8"?>
+<inkml:ink xmlns:inkml="http://www.w3.org/2003/InkML">
+  <inkml:definitions>
+    <inkml:context xml:id="ctx0">
+      <inkml:inkSource xml:id="inkSrc0">
+        <inkml:traceFormat>
+          <inkml:channel name="X" type="integer" min="-2.14748E9" max="2.14748E9" units="cm"/>
+          <inkml:channel name="Y" type="integer" min="-2.14748E9" max="2.14748E9" units="cm"/>
+        </inkml:traceFormat>
+        <inkml:channelProperties>
+          <inkml:channelProperty channel="X" name="resolution" value="1000" units="1/cm"/>
+          <inkml:channelProperty channel="Y" name="resolution" value="1000" units="1/cm"/>
+        </inkml:channelProperties>
+      </inkml:inkSource>
+      <inkml:timestamp xml:id="ts0" timeString="2026-06-12T14:56:14.998"/>
+    </inkml:context>
+    <inkml:brush xml:id="br0">
+      <inkml:brushProperty name="width" value="0.05" units="cm"/>
+      <inkml:brushProperty name="height" value="0.05" units="cm"/>
+      <inkml:brushProperty name="ignorePressure" value="1"/>
+    </inkml:brush>
+  </inkml:definitions>
+  <inkml:trace contextRef="#ctx0" brushRef="#br0">1 1,'0'26800,"0"-26772</inkml:trace>
+</inkml:ink>
+</file>
+
+<file path=word/ink/ink3.xml><?xml version="1.0" encoding="utf-8"?>
+<inkml:ink xmlns:inkml="http://www.w3.org/2003/InkML">
+  <inkml:definitions>
+    <inkml:context xml:id="ctx0">
+      <inkml:inkSource xml:id="inkSrc0">
+        <inkml:traceFormat>
+          <inkml:channel name="X" type="integer" min="-2.14748E9" max="2.14748E9" units="cm"/>
+          <inkml:channel name="Y" type="integer" min="-2.14748E9" max="2.14748E9" units="cm"/>
+        </inkml:traceFormat>
+        <inkml:channelProperties>
+          <inkml:channelProperty channel="X" name="resolution" value="1000" units="1/cm"/>
+          <inkml:channelProperty channel="Y" name="resolution" value="1000" units="1/cm"/>
+        </inkml:channelProperties>
+      </inkml:inkSource>
+      <inkml:timestamp xml:id="ts0" timeString="2026-06-12T14:56:27.190"/>
+    </inkml:context>
+    <inkml:brush xml:id="br0">
+      <inkml:brushProperty name="width" value="0.05" units="cm"/>
+      <inkml:brushProperty name="height" value="0.05" units="cm"/>
+      <inkml:brushProperty name="ignorePressure" value="1"/>
+    </inkml:brush>
+  </inkml:definitions>
+  <inkml:trace contextRef="#ctx0" brushRef="#br0">1 1,'0'27945,"0"-27916</inkml:trace>
+</inkml:ink>
 </file>
 
 <file path=word/theme/theme1.xml><?xml version="1.0" encoding="utf-8"?>

</xml_diff>

<commit_message>
Prefer Italian locale; enable demo links
Use stored Italian preference as the initial language (change initialLanguage check to 'it'). Enable the English and Italian project demo links by setting demoUnavailable to false in both en.json and it.json. Also update the CV binary (src/profile/CV_Mirko_Ando.docx).
</commit_message>
<xml_diff>
--- a/src/profile/CV_Mirko_Ando.docx
+++ b/src/profile/CV_Mirko_Ando.docx
@@ -12,22 +12,21 @@
       </w:pPr>
       <w:r>
         <w:rPr>
-          <w:rFonts w:ascii="Calibri" w:hAnsi="Calibri" w:cs="Calibri"/>
           <w:noProof/>
         </w:rPr>
         <w:drawing>
-          <wp:anchor distT="0" distB="0" distL="114300" distR="114300" simplePos="0" relativeHeight="251661312" behindDoc="1" locked="0" layoutInCell="1" allowOverlap="1" wp14:anchorId="5175737A" wp14:editId="65242ABE">
+          <wp:anchor distT="0" distB="0" distL="114300" distR="114300" simplePos="0" relativeHeight="251665408" behindDoc="1" locked="0" layoutInCell="1" allowOverlap="1" wp14:anchorId="0D4EC1C2" wp14:editId="66364438">
             <wp:simplePos x="0" y="0"/>
             <wp:positionH relativeFrom="column">
-              <wp:posOffset>5231861</wp:posOffset>
+              <wp:posOffset>5316855</wp:posOffset>
             </wp:positionH>
-            <wp:positionV relativeFrom="paragraph">
-              <wp:posOffset>103470</wp:posOffset>
+            <wp:positionV relativeFrom="page">
+              <wp:posOffset>182880</wp:posOffset>
             </wp:positionV>
-            <wp:extent cx="1433830" cy="2152090"/>
-            <wp:effectExtent l="190500" t="152400" r="166370" b="191135"/>
+            <wp:extent cx="1471930" cy="2209800"/>
+            <wp:effectExtent l="152400" t="152400" r="356870" b="361950"/>
             <wp:wrapNone/>
-            <wp:docPr id="419781564" name="Immagine 1"/>
+            <wp:docPr id="1619061723" name="Immagine 1"/>
             <wp:cNvGraphicFramePr>
               <a:graphicFrameLocks xmlns:a="http://schemas.openxmlformats.org/drawingml/2006/main" noChangeAspect="1"/>
             </wp:cNvGraphicFramePr>
@@ -35,8 +34,10 @@
               <a:graphicData uri="http://schemas.openxmlformats.org/drawingml/2006/picture">
                 <pic:pic xmlns:pic="http://schemas.openxmlformats.org/drawingml/2006/picture">
                   <pic:nvPicPr>
-                    <pic:cNvPr id="419781564" name="Immagine 1"/>
-                    <pic:cNvPicPr/>
+                    <pic:cNvPr id="0" name="Picture 1"/>
+                    <pic:cNvPicPr>
+                      <a:picLocks noChangeAspect="1" noChangeArrowheads="1"/>
+                    </pic:cNvPicPr>
                   </pic:nvPicPr>
                   <pic:blipFill>
                     <a:blip r:embed="rId7" cstate="print">
@@ -46,48 +47,29 @@
                         </a:ext>
                       </a:extLst>
                     </a:blip>
+                    <a:srcRect/>
                     <a:stretch>
                       <a:fillRect/>
                     </a:stretch>
                   </pic:blipFill>
-                  <pic:spPr>
+                  <pic:spPr bwMode="auto">
                     <a:xfrm>
                       <a:off x="0" y="0"/>
-                      <a:ext cx="1433830" cy="2152090"/>
+                      <a:ext cx="1471930" cy="2209800"/>
                     </a:xfrm>
                     <a:prstGeom prst="rect">
                       <a:avLst/>
                     </a:prstGeom>
-                    <a:solidFill>
-                      <a:srgbClr val="FFFFFF">
-                        <a:shade val="85000"/>
-                      </a:srgbClr>
-                    </a:solidFill>
-                    <a:ln w="190500" cap="sq">
-                      <a:solidFill>
-                        <a:srgbClr val="FFFFFF"/>
-                      </a:solidFill>
-                      <a:miter lim="800000"/>
+                    <a:ln>
+                      <a:noFill/>
                     </a:ln>
                     <a:effectLst>
-                      <a:outerShdw blurRad="55000" dist="18000" dir="5400000" algn="tl" rotWithShape="0">
-                        <a:srgbClr val="000000">
-                          <a:alpha val="40000"/>
+                      <a:outerShdw blurRad="292100" dist="139700" dir="2700000" algn="tl" rotWithShape="0">
+                        <a:srgbClr val="333333">
+                          <a:alpha val="65000"/>
                         </a:srgbClr>
                       </a:outerShdw>
                     </a:effectLst>
-                    <a:scene3d>
-                      <a:camera prst="orthographicFront"/>
-                      <a:lightRig rig="twoPt" dir="t">
-                        <a:rot lat="0" lon="0" rev="7200000"/>
-                      </a:lightRig>
-                    </a:scene3d>
-                    <a:sp3d>
-                      <a:bevelT w="25400" h="19050"/>
-                      <a:contourClr>
-                        <a:srgbClr val="FFFFFF"/>
-                      </a:contourClr>
-                    </a:sp3d>
                   </pic:spPr>
                 </pic:pic>
               </a:graphicData>
@@ -2325,47 +2307,7 @@
                 <w:szCs w:val="22"/>
                 <w:lang w:val="it-IT"/>
               </w:rPr>
-              <w:t>{{</w:t>
-            </w:r>
-            <w:r>
-              <w:rPr>
-                <w:rFonts w:ascii="Calibri" w:hAnsi="Calibri" w:cs="Calibri"/>
-                <w:i w:val="0"/>
-                <w:sz w:val="22"/>
-                <w:szCs w:val="22"/>
-                <w:lang w:val="it-IT"/>
-              </w:rPr>
-              <w:t>experience</w:t>
-            </w:r>
-            <w:r>
-              <w:rPr>
-                <w:rFonts w:ascii="Calibri" w:hAnsi="Calibri" w:cs="Calibri"/>
-                <w:i w:val="0"/>
-                <w:sz w:val="22"/>
-                <w:szCs w:val="22"/>
-                <w:lang w:val="it-IT"/>
-              </w:rPr>
-              <w:t>.</w:t>
-            </w:r>
-            <w:r>
-              <w:rPr>
-                <w:rFonts w:ascii="Calibri" w:hAnsi="Calibri" w:cs="Calibri"/>
-                <w:i w:val="0"/>
-                <w:sz w:val="22"/>
-                <w:szCs w:val="22"/>
-                <w:lang w:val="it-IT"/>
-              </w:rPr>
-              <w:t>title</w:t>
-            </w:r>
-            <w:r>
-              <w:rPr>
-                <w:rFonts w:ascii="Calibri" w:hAnsi="Calibri" w:cs="Calibri"/>
-                <w:i w:val="0"/>
-                <w:sz w:val="22"/>
-                <w:szCs w:val="22"/>
-                <w:lang w:val="it-IT"/>
-              </w:rPr>
-              <w:t>}}</w:t>
+              <w:t>{{experience.title}}</w:t>
             </w:r>
           </w:p>
           <w:p>
@@ -2388,17 +2330,22 @@
                 <w:sz w:val="20"/>
                 <w:lang w:val="it-IT"/>
               </w:rPr>
-              <w:t>{{#experience.</w:t>
-            </w:r>
-            <w:r>
+              <w:t>{{#experience.softSkills}}</w:t>
+            </w:r>
+          </w:p>
+          <w:p>
+            <w:pPr>
+              <w:pStyle w:val="OiaeaeiYiio2"/>
+              <w:widowControl/>
+              <w:spacing w:before="20" w:after="20"/>
+              <w:jc w:val="left"/>
               <w:rPr>
                 <w:rFonts w:ascii="Calibri" w:hAnsi="Calibri" w:cs="Calibri"/>
                 <w:i w:val="0"/>
                 <w:sz w:val="20"/>
                 <w:lang w:val="it-IT"/>
               </w:rPr>
-              <w:t>softSkills</w:t>
-            </w:r>
+            </w:pPr>
             <w:r>
               <w:rPr>
                 <w:rFonts w:ascii="Calibri" w:hAnsi="Calibri" w:cs="Calibri"/>
@@ -2406,29 +2353,6 @@
                 <w:sz w:val="20"/>
                 <w:lang w:val="it-IT"/>
               </w:rPr>
-              <w:t>}}</w:t>
-            </w:r>
-          </w:p>
-          <w:p>
-            <w:pPr>
-              <w:pStyle w:val="OiaeaeiYiio2"/>
-              <w:widowControl/>
-              <w:spacing w:before="20" w:after="20"/>
-              <w:jc w:val="left"/>
-              <w:rPr>
-                <w:rFonts w:ascii="Calibri" w:hAnsi="Calibri" w:cs="Calibri"/>
-                <w:i w:val="0"/>
-                <w:sz w:val="20"/>
-                <w:lang w:val="it-IT"/>
-              </w:rPr>
-            </w:pPr>
-            <w:r>
-              <w:rPr>
-                <w:rFonts w:ascii="Calibri" w:hAnsi="Calibri" w:cs="Calibri"/>
-                <w:i w:val="0"/>
-                <w:sz w:val="20"/>
-                <w:lang w:val="it-IT"/>
-              </w:rPr>
               <w:t>- {{title}}</w:t>
             </w:r>
           </w:p>
@@ -2472,6 +2396,20 @@
               </w:rPr>
               <w:t>}}</w:t>
             </w:r>
+          </w:p>
+          <w:p>
+            <w:pPr>
+              <w:pStyle w:val="OiaeaeiYiio2"/>
+              <w:widowControl/>
+              <w:spacing w:before="20" w:after="20"/>
+              <w:jc w:val="center"/>
+              <w:rPr>
+                <w:rFonts w:ascii="Calibri" w:hAnsi="Calibri" w:cs="Calibri"/>
+                <w:iCs/>
+                <w:sz w:val="20"/>
+                <w:lang w:val="it-IT"/>
+              </w:rPr>
+            </w:pPr>
           </w:p>
           <w:p>
             <w:pPr>
@@ -2640,23 +2578,7 @@
                 <w:smallCaps/>
                 <w:lang w:val="it-IT"/>
               </w:rPr>
-              <w:t>{{</w:t>
-            </w:r>
-            <w:r>
-              <w:rPr>
-                <w:rFonts w:ascii="Calibri" w:hAnsi="Calibri" w:cs="Calibri"/>
-                <w:smallCaps/>
-                <w:lang w:val="it-IT"/>
-              </w:rPr>
-              <w:t>/</w:t>
-            </w:r>
-            <w:r>
-              <w:rPr>
-                <w:rFonts w:ascii="Calibri" w:hAnsi="Calibri" w:cs="Calibri"/>
-                <w:smallCaps/>
-                <w:lang w:val="it-IT"/>
-              </w:rPr>
-              <w:t>about.stats}}</w:t>
+              <w:t>{{/about.stats}}</w:t>
             </w:r>
           </w:p>
         </w:tc>
@@ -2770,27 +2692,7 @@
                 <w:smallCaps/>
                 <w:lang w:val="it-IT"/>
               </w:rPr>
-              <w:t>{{</w:t>
-            </w:r>
-            <w:r>
-              <w:rPr>
-                <w:rFonts w:ascii="Calibri" w:hAnsi="Calibri" w:cs="Calibri"/>
-                <w:i/>
-                <w:iCs/>
-                <w:smallCaps/>
-                <w:lang w:val="it-IT"/>
-              </w:rPr>
-              <w:t>value</w:t>
-            </w:r>
-            <w:r>
-              <w:rPr>
-                <w:rFonts w:ascii="Calibri" w:hAnsi="Calibri" w:cs="Calibri"/>
-                <w:i/>
-                <w:iCs/>
-                <w:smallCaps/>
-                <w:lang w:val="it-IT"/>
-              </w:rPr>
-              <w:t>}}</w:t>
+              <w:t>{{value}}</w:t>
             </w:r>
           </w:p>
           <w:p>
@@ -4611,27 +4513,7 @@
                   <w:szCs w:val="14"/>
                   <w:lang w:val="it-IT"/>
                 </w:rPr>
-                <w:t>https://mirkoandoportfolio.n</w:t>
-              </w:r>
-              <w:r>
-                <w:rPr>
-                  <w:rStyle w:val="Collegamentoipertestuale"/>
-                  <w:rFonts w:ascii="Calibri" w:hAnsi="Calibri" w:cs="Calibri"/>
-                  <w:sz w:val="18"/>
-                  <w:szCs w:val="14"/>
-                  <w:lang w:val="it-IT"/>
-                </w:rPr>
-                <w:t>e</w:t>
-              </w:r>
-              <w:r>
-                <w:rPr>
-                  <w:rStyle w:val="Collegamentoipertestuale"/>
-                  <w:rFonts w:ascii="Calibri" w:hAnsi="Calibri" w:cs="Calibri"/>
-                  <w:sz w:val="18"/>
-                  <w:szCs w:val="14"/>
-                  <w:lang w:val="it-IT"/>
-                </w:rPr>
-                <w:t>tlify.app/</w:t>
+                <w:t>https://mirkoandoportfolio.netlify.app/</w:t>
               </w:r>
             </w:hyperlink>
           </w:p>
@@ -5246,6 +5128,7 @@
   <w:style w:type="character" w:default="1" w:styleId="Carpredefinitoparagrafo">
     <w:name w:val="Default Paragraph Font"/>
     <w:uiPriority w:val="1"/>
+    <w:semiHidden/>
     <w:unhideWhenUsed/>
   </w:style>
   <w:style w:type="table" w:default="1" w:styleId="Tabellanormale">

</xml_diff>

<commit_message>
Enable demo and prefer Italian from storage
Set demoUnavailable to false in both en.json and it.json to enable the English-Legacy-Quiz live demo links. Update script.js to treat a stored language preference of "it" as the initial language so the site respects Italian when saved. Also update the CV document binary (src/profile/CV_Mirko_Ando.docx).
</commit_message>
<xml_diff>
--- a/src/profile/CV_Mirko_Ando.docx
+++ b/src/profile/CV_Mirko_Ando.docx
@@ -12,22 +12,21 @@
       </w:pPr>
       <w:r>
         <w:rPr>
-          <w:rFonts w:ascii="Calibri" w:hAnsi="Calibri" w:cs="Calibri"/>
           <w:noProof/>
         </w:rPr>
         <w:drawing>
-          <wp:anchor distT="0" distB="0" distL="114300" distR="114300" simplePos="0" relativeHeight="251661312" behindDoc="1" locked="0" layoutInCell="1" allowOverlap="1" wp14:anchorId="5175737A" wp14:editId="65242ABE">
+          <wp:anchor distT="0" distB="0" distL="114300" distR="114300" simplePos="0" relativeHeight="251665408" behindDoc="1" locked="0" layoutInCell="1" allowOverlap="1" wp14:anchorId="0D4EC1C2" wp14:editId="66364438">
             <wp:simplePos x="0" y="0"/>
             <wp:positionH relativeFrom="column">
-              <wp:posOffset>5231861</wp:posOffset>
+              <wp:posOffset>5316855</wp:posOffset>
             </wp:positionH>
-            <wp:positionV relativeFrom="paragraph">
-              <wp:posOffset>103470</wp:posOffset>
+            <wp:positionV relativeFrom="page">
+              <wp:posOffset>182880</wp:posOffset>
             </wp:positionV>
-            <wp:extent cx="1433830" cy="2152090"/>
-            <wp:effectExtent l="190500" t="152400" r="166370" b="191135"/>
+            <wp:extent cx="1471930" cy="2209800"/>
+            <wp:effectExtent l="152400" t="152400" r="356870" b="361950"/>
             <wp:wrapNone/>
-            <wp:docPr id="419781564" name="Immagine 1"/>
+            <wp:docPr id="1619061723" name="Immagine 1"/>
             <wp:cNvGraphicFramePr>
               <a:graphicFrameLocks xmlns:a="http://schemas.openxmlformats.org/drawingml/2006/main" noChangeAspect="1"/>
             </wp:cNvGraphicFramePr>
@@ -35,8 +34,10 @@
               <a:graphicData uri="http://schemas.openxmlformats.org/drawingml/2006/picture">
                 <pic:pic xmlns:pic="http://schemas.openxmlformats.org/drawingml/2006/picture">
                   <pic:nvPicPr>
-                    <pic:cNvPr id="419781564" name="Immagine 1"/>
-                    <pic:cNvPicPr/>
+                    <pic:cNvPr id="0" name="Picture 1"/>
+                    <pic:cNvPicPr>
+                      <a:picLocks noChangeAspect="1" noChangeArrowheads="1"/>
+                    </pic:cNvPicPr>
                   </pic:nvPicPr>
                   <pic:blipFill>
                     <a:blip r:embed="rId7" cstate="print">
@@ -46,48 +47,29 @@
                         </a:ext>
                       </a:extLst>
                     </a:blip>
+                    <a:srcRect/>
                     <a:stretch>
                       <a:fillRect/>
                     </a:stretch>
                   </pic:blipFill>
-                  <pic:spPr>
+                  <pic:spPr bwMode="auto">
                     <a:xfrm>
                       <a:off x="0" y="0"/>
-                      <a:ext cx="1433830" cy="2152090"/>
+                      <a:ext cx="1471930" cy="2209800"/>
                     </a:xfrm>
                     <a:prstGeom prst="rect">
                       <a:avLst/>
                     </a:prstGeom>
-                    <a:solidFill>
-                      <a:srgbClr val="FFFFFF">
-                        <a:shade val="85000"/>
-                      </a:srgbClr>
-                    </a:solidFill>
-                    <a:ln w="190500" cap="sq">
-                      <a:solidFill>
-                        <a:srgbClr val="FFFFFF"/>
-                      </a:solidFill>
-                      <a:miter lim="800000"/>
+                    <a:ln>
+                      <a:noFill/>
                     </a:ln>
                     <a:effectLst>
-                      <a:outerShdw blurRad="55000" dist="18000" dir="5400000" algn="tl" rotWithShape="0">
-                        <a:srgbClr val="000000">
-                          <a:alpha val="40000"/>
+                      <a:outerShdw blurRad="292100" dist="139700" dir="2700000" algn="tl" rotWithShape="0">
+                        <a:srgbClr val="333333">
+                          <a:alpha val="65000"/>
                         </a:srgbClr>
                       </a:outerShdw>
                     </a:effectLst>
-                    <a:scene3d>
-                      <a:camera prst="orthographicFront"/>
-                      <a:lightRig rig="twoPt" dir="t">
-                        <a:rot lat="0" lon="0" rev="7200000"/>
-                      </a:lightRig>
-                    </a:scene3d>
-                    <a:sp3d>
-                      <a:bevelT w="25400" h="19050"/>
-                      <a:contourClr>
-                        <a:srgbClr val="FFFFFF"/>
-                      </a:contourClr>
-                    </a:sp3d>
                   </pic:spPr>
                 </pic:pic>
               </a:graphicData>
@@ -2325,47 +2307,7 @@
                 <w:szCs w:val="22"/>
                 <w:lang w:val="it-IT"/>
               </w:rPr>
-              <w:t>{{</w:t>
-            </w:r>
-            <w:r>
-              <w:rPr>
-                <w:rFonts w:ascii="Calibri" w:hAnsi="Calibri" w:cs="Calibri"/>
-                <w:i w:val="0"/>
-                <w:sz w:val="22"/>
-                <w:szCs w:val="22"/>
-                <w:lang w:val="it-IT"/>
-              </w:rPr>
-              <w:t>experience</w:t>
-            </w:r>
-            <w:r>
-              <w:rPr>
-                <w:rFonts w:ascii="Calibri" w:hAnsi="Calibri" w:cs="Calibri"/>
-                <w:i w:val="0"/>
-                <w:sz w:val="22"/>
-                <w:szCs w:val="22"/>
-                <w:lang w:val="it-IT"/>
-              </w:rPr>
-              <w:t>.</w:t>
-            </w:r>
-            <w:r>
-              <w:rPr>
-                <w:rFonts w:ascii="Calibri" w:hAnsi="Calibri" w:cs="Calibri"/>
-                <w:i w:val="0"/>
-                <w:sz w:val="22"/>
-                <w:szCs w:val="22"/>
-                <w:lang w:val="it-IT"/>
-              </w:rPr>
-              <w:t>title</w:t>
-            </w:r>
-            <w:r>
-              <w:rPr>
-                <w:rFonts w:ascii="Calibri" w:hAnsi="Calibri" w:cs="Calibri"/>
-                <w:i w:val="0"/>
-                <w:sz w:val="22"/>
-                <w:szCs w:val="22"/>
-                <w:lang w:val="it-IT"/>
-              </w:rPr>
-              <w:t>}}</w:t>
+              <w:t>{{experience.title}}</w:t>
             </w:r>
           </w:p>
           <w:p>
@@ -2388,17 +2330,22 @@
                 <w:sz w:val="20"/>
                 <w:lang w:val="it-IT"/>
               </w:rPr>
-              <w:t>{{#experience.</w:t>
-            </w:r>
-            <w:r>
+              <w:t>{{#experience.softSkills}}</w:t>
+            </w:r>
+          </w:p>
+          <w:p>
+            <w:pPr>
+              <w:pStyle w:val="OiaeaeiYiio2"/>
+              <w:widowControl/>
+              <w:spacing w:before="20" w:after="20"/>
+              <w:jc w:val="left"/>
               <w:rPr>
                 <w:rFonts w:ascii="Calibri" w:hAnsi="Calibri" w:cs="Calibri"/>
                 <w:i w:val="0"/>
                 <w:sz w:val="20"/>
                 <w:lang w:val="it-IT"/>
               </w:rPr>
-              <w:t>softSkills</w:t>
-            </w:r>
+            </w:pPr>
             <w:r>
               <w:rPr>
                 <w:rFonts w:ascii="Calibri" w:hAnsi="Calibri" w:cs="Calibri"/>
@@ -2406,29 +2353,6 @@
                 <w:sz w:val="20"/>
                 <w:lang w:val="it-IT"/>
               </w:rPr>
-              <w:t>}}</w:t>
-            </w:r>
-          </w:p>
-          <w:p>
-            <w:pPr>
-              <w:pStyle w:val="OiaeaeiYiio2"/>
-              <w:widowControl/>
-              <w:spacing w:before="20" w:after="20"/>
-              <w:jc w:val="left"/>
-              <w:rPr>
-                <w:rFonts w:ascii="Calibri" w:hAnsi="Calibri" w:cs="Calibri"/>
-                <w:i w:val="0"/>
-                <w:sz w:val="20"/>
-                <w:lang w:val="it-IT"/>
-              </w:rPr>
-            </w:pPr>
-            <w:r>
-              <w:rPr>
-                <w:rFonts w:ascii="Calibri" w:hAnsi="Calibri" w:cs="Calibri"/>
-                <w:i w:val="0"/>
-                <w:sz w:val="20"/>
-                <w:lang w:val="it-IT"/>
-              </w:rPr>
               <w:t>- {{title}}</w:t>
             </w:r>
           </w:p>
@@ -2472,6 +2396,20 @@
               </w:rPr>
               <w:t>}}</w:t>
             </w:r>
+          </w:p>
+          <w:p>
+            <w:pPr>
+              <w:pStyle w:val="OiaeaeiYiio2"/>
+              <w:widowControl/>
+              <w:spacing w:before="20" w:after="20"/>
+              <w:jc w:val="center"/>
+              <w:rPr>
+                <w:rFonts w:ascii="Calibri" w:hAnsi="Calibri" w:cs="Calibri"/>
+                <w:iCs/>
+                <w:sz w:val="20"/>
+                <w:lang w:val="it-IT"/>
+              </w:rPr>
+            </w:pPr>
           </w:p>
           <w:p>
             <w:pPr>
@@ -2640,23 +2578,7 @@
                 <w:smallCaps/>
                 <w:lang w:val="it-IT"/>
               </w:rPr>
-              <w:t>{{</w:t>
-            </w:r>
-            <w:r>
-              <w:rPr>
-                <w:rFonts w:ascii="Calibri" w:hAnsi="Calibri" w:cs="Calibri"/>
-                <w:smallCaps/>
-                <w:lang w:val="it-IT"/>
-              </w:rPr>
-              <w:t>/</w:t>
-            </w:r>
-            <w:r>
-              <w:rPr>
-                <w:rFonts w:ascii="Calibri" w:hAnsi="Calibri" w:cs="Calibri"/>
-                <w:smallCaps/>
-                <w:lang w:val="it-IT"/>
-              </w:rPr>
-              <w:t>about.stats}}</w:t>
+              <w:t>{{/about.stats}}</w:t>
             </w:r>
           </w:p>
         </w:tc>
@@ -2770,27 +2692,7 @@
                 <w:smallCaps/>
                 <w:lang w:val="it-IT"/>
               </w:rPr>
-              <w:t>{{</w:t>
-            </w:r>
-            <w:r>
-              <w:rPr>
-                <w:rFonts w:ascii="Calibri" w:hAnsi="Calibri" w:cs="Calibri"/>
-                <w:i/>
-                <w:iCs/>
-                <w:smallCaps/>
-                <w:lang w:val="it-IT"/>
-              </w:rPr>
-              <w:t>value</w:t>
-            </w:r>
-            <w:r>
-              <w:rPr>
-                <w:rFonts w:ascii="Calibri" w:hAnsi="Calibri" w:cs="Calibri"/>
-                <w:i/>
-                <w:iCs/>
-                <w:smallCaps/>
-                <w:lang w:val="it-IT"/>
-              </w:rPr>
-              <w:t>}}</w:t>
+              <w:t>{{value}}</w:t>
             </w:r>
           </w:p>
           <w:p>
@@ -4611,27 +4513,7 @@
                   <w:szCs w:val="14"/>
                   <w:lang w:val="it-IT"/>
                 </w:rPr>
-                <w:t>https://mirkoandoportfolio.n</w:t>
-              </w:r>
-              <w:r>
-                <w:rPr>
-                  <w:rStyle w:val="Collegamentoipertestuale"/>
-                  <w:rFonts w:ascii="Calibri" w:hAnsi="Calibri" w:cs="Calibri"/>
-                  <w:sz w:val="18"/>
-                  <w:szCs w:val="14"/>
-                  <w:lang w:val="it-IT"/>
-                </w:rPr>
-                <w:t>e</w:t>
-              </w:r>
-              <w:r>
-                <w:rPr>
-                  <w:rStyle w:val="Collegamentoipertestuale"/>
-                  <w:rFonts w:ascii="Calibri" w:hAnsi="Calibri" w:cs="Calibri"/>
-                  <w:sz w:val="18"/>
-                  <w:szCs w:val="14"/>
-                  <w:lang w:val="it-IT"/>
-                </w:rPr>
-                <w:t>tlify.app/</w:t>
+                <w:t>https://mirkoandoportfolio.netlify.app/</w:t>
               </w:r>
             </w:hyperlink>
           </w:p>
@@ -5246,6 +5128,7 @@
   <w:style w:type="character" w:default="1" w:styleId="Carpredefinitoparagrafo">
     <w:name w:val="Default Paragraph Font"/>
     <w:uiPriority w:val="1"/>
+    <w:semiHidden/>
     <w:unhideWhenUsed/>
   </w:style>
   <w:style w:type="table" w:default="1" w:styleId="Tabellanormale">

</xml_diff>

<commit_message>
Update CV for Mirko Ando: remove address and clean up formatting
</commit_message>
<xml_diff>
--- a/src/profile/CV_Mirko_Ando.docx
+++ b/src/profile/CV_Mirko_Ando.docx
@@ -488,7 +488,7 @@
                 <w:b w:val="0"/>
                 <w:lang w:val="it-IT"/>
               </w:rPr>
-              <w:t>Indirizzo</w:t>
+              <w:t>Telefono</w:t>
             </w:r>
           </w:p>
         </w:tc>
@@ -564,7 +564,7 @@
                 <w:sz w:val="22"/>
                 <w:szCs w:val="22"/>
               </w:rPr>
-              <w:t>.address}}</w:t>
+              <w:t>.phone}}</w:t>
             </w:r>
           </w:p>
         </w:tc>
@@ -597,7 +597,7 @@
                 <w:b w:val="0"/>
                 <w:lang w:val="it-IT"/>
               </w:rPr>
-              <w:t>Telefono</w:t>
+              <w:t>E-mail</w:t>
             </w:r>
           </w:p>
         </w:tc>
@@ -675,7 +675,7 @@
                 <w:sz w:val="22"/>
                 <w:szCs w:val="22"/>
               </w:rPr>
-              <w:t>.phone}}</w:t>
+              <w:t>.email}}</w:t>
             </w:r>
           </w:p>
         </w:tc>
@@ -708,7 +708,7 @@
                 <w:b w:val="0"/>
                 <w:lang w:val="it-IT"/>
               </w:rPr>
-              <w:t>E-mail</w:t>
+              <w:t>Nazionalità</w:t>
             </w:r>
           </w:p>
         </w:tc>
@@ -786,40 +786,11 @@
                 <w:sz w:val="22"/>
                 <w:szCs w:val="22"/>
               </w:rPr>
-              <w:t>.email}}</w:t>
+              <w:t>.nationality}}</w:t>
             </w:r>
           </w:p>
         </w:tc>
       </w:tr>
-    </w:tbl>
-    <w:p>
-      <w:pPr>
-        <w:pStyle w:val="Aaoeeu"/>
-        <w:widowControl/>
-        <w:spacing w:before="120"/>
-        <w:rPr>
-          <w:rFonts w:ascii="Calibri" w:hAnsi="Calibri" w:cs="Calibri"/>
-          <w:sz w:val="16"/>
-          <w:lang w:val="it-IT"/>
-        </w:rPr>
-      </w:pPr>
-    </w:p>
-    <w:tbl>
-      <w:tblPr>
-        <w:tblW w:w="10456" w:type="dxa"/>
-        <w:tblInd w:w="-108" w:type="dxa"/>
-        <w:tblLayout w:type="fixed"/>
-        <w:tblCellMar>
-          <w:left w:w="10" w:type="dxa"/>
-          <w:right w:w="10" w:type="dxa"/>
-        </w:tblCellMar>
-        <w:tblLook w:val="0000" w:firstRow="0" w:lastRow="0" w:firstColumn="0" w:lastColumn="0" w:noHBand="0" w:noVBand="0"/>
-      </w:tblPr>
-      <w:tblGrid>
-        <w:gridCol w:w="2943"/>
-        <w:gridCol w:w="284"/>
-        <w:gridCol w:w="7229"/>
-      </w:tblGrid>
       <w:tr>
         <w:tc>
           <w:tcPr>
@@ -835,7 +806,7 @@
             <w:pPr>
               <w:pStyle w:val="Aeeaoaeaa1"/>
               <w:widowControl/>
-              <w:spacing w:before="20" w:after="20"/>
+              <w:spacing w:before="40" w:after="40"/>
               <w:rPr>
                 <w:rFonts w:ascii="Calibri" w:hAnsi="Calibri" w:cs="Calibri"/>
                 <w:b w:val="0"/>
@@ -848,7 +819,7 @@
                 <w:b w:val="0"/>
                 <w:lang w:val="it-IT"/>
               </w:rPr>
-              <w:t>Nazionalità</w:t>
+              <w:t>Data di nascita</w:t>
             </w:r>
           </w:p>
         </w:tc>
@@ -867,9 +838,10 @@
               <w:pStyle w:val="Aaoeeu"/>
               <w:widowControl/>
               <w:snapToGrid w:val="0"/>
-              <w:spacing w:before="20" w:after="20"/>
-              <w:rPr>
-                <w:rFonts w:ascii="Calibri" w:hAnsi="Calibri" w:cs="Calibri"/>
+              <w:spacing w:before="40" w:after="40"/>
+              <w:rPr>
+                <w:rFonts w:ascii="Calibri" w:hAnsi="Calibri" w:cs="Calibri"/>
+                <w:sz w:val="22"/>
                 <w:lang w:val="it-IT"/>
               </w:rPr>
             </w:pPr>
@@ -894,10 +866,11 @@
                 <w:tab w:val="clear" w:pos="8306"/>
               </w:tabs>
               <w:snapToGrid w:val="0"/>
-              <w:spacing w:before="20" w:after="20"/>
-              <w:rPr>
-                <w:rFonts w:ascii="Calibri" w:hAnsi="Calibri" w:cs="Calibri"/>
-                <w:lang w:val="it-IT"/>
+              <w:spacing w:before="40" w:after="40"/>
+              <w:rPr>
+                <w:rFonts w:ascii="Calibri" w:hAnsi="Calibri" w:cs="Calibri"/>
+                <w:sz w:val="22"/>
+                <w:szCs w:val="22"/>
               </w:rPr>
             </w:pPr>
             <w:r>
@@ -923,161 +896,12 @@
                 <w:sz w:val="22"/>
                 <w:szCs w:val="22"/>
               </w:rPr>
-              <w:t>.nationality}}</w:t>
+              <w:t>.dateOfBirth}}</w:t>
             </w:r>
           </w:p>
         </w:tc>
       </w:tr>
     </w:tbl>
-    <w:p>
-      <w:pPr>
-        <w:pStyle w:val="Aaoeeu"/>
-        <w:widowControl/>
-        <w:spacing w:before="20" w:after="20"/>
-        <w:rPr>
-          <w:rFonts w:ascii="Calibri" w:hAnsi="Calibri" w:cs="Calibri"/>
-          <w:sz w:val="10"/>
-          <w:lang w:val="it-IT"/>
-        </w:rPr>
-      </w:pPr>
-    </w:p>
-    <w:tbl>
-      <w:tblPr>
-        <w:tblW w:w="10456" w:type="dxa"/>
-        <w:tblInd w:w="-108" w:type="dxa"/>
-        <w:tblLayout w:type="fixed"/>
-        <w:tblCellMar>
-          <w:left w:w="10" w:type="dxa"/>
-          <w:right w:w="10" w:type="dxa"/>
-        </w:tblCellMar>
-        <w:tblLook w:val="0000" w:firstRow="0" w:lastRow="0" w:firstColumn="0" w:lastColumn="0" w:noHBand="0" w:noVBand="0"/>
-      </w:tblPr>
-      <w:tblGrid>
-        <w:gridCol w:w="2943"/>
-        <w:gridCol w:w="284"/>
-        <w:gridCol w:w="7229"/>
-      </w:tblGrid>
-      <w:tr>
-        <w:trPr>
-          <w:trHeight w:val="80"/>
-        </w:trPr>
-        <w:tc>
-          <w:tcPr>
-            <w:tcW w:w="2943" w:type="dxa"/>
-            <w:tcMar>
-              <w:top w:w="0" w:type="dxa"/>
-              <w:left w:w="108" w:type="dxa"/>
-              <w:bottom w:w="0" w:type="dxa"/>
-              <w:right w:w="108" w:type="dxa"/>
-            </w:tcMar>
-          </w:tcPr>
-          <w:p>
-            <w:pPr>
-              <w:pStyle w:val="Aeeaoaeaa1"/>
-              <w:widowControl/>
-              <w:spacing w:before="20" w:after="20"/>
-              <w:rPr>
-                <w:rFonts w:ascii="Calibri" w:hAnsi="Calibri" w:cs="Calibri"/>
-                <w:b w:val="0"/>
-                <w:lang w:val="it-IT"/>
-              </w:rPr>
-            </w:pPr>
-            <w:r>
-              <w:rPr>
-                <w:rFonts w:ascii="Calibri" w:hAnsi="Calibri" w:cs="Calibri"/>
-                <w:b w:val="0"/>
-                <w:lang w:val="it-IT"/>
-              </w:rPr>
-              <w:t>Data di nascita</w:t>
-            </w:r>
-          </w:p>
-        </w:tc>
-        <w:tc>
-          <w:tcPr>
-            <w:tcW w:w="284" w:type="dxa"/>
-            <w:tcMar>
-              <w:top w:w="0" w:type="dxa"/>
-              <w:left w:w="108" w:type="dxa"/>
-              <w:bottom w:w="0" w:type="dxa"/>
-              <w:right w:w="108" w:type="dxa"/>
-            </w:tcMar>
-          </w:tcPr>
-          <w:p>
-            <w:pPr>
-              <w:pStyle w:val="Aaoeeu"/>
-              <w:widowControl/>
-              <w:snapToGrid w:val="0"/>
-              <w:spacing w:before="20" w:after="20"/>
-              <w:rPr>
-                <w:rFonts w:ascii="Calibri" w:hAnsi="Calibri" w:cs="Calibri"/>
-                <w:lang w:val="it-IT"/>
-              </w:rPr>
-            </w:pPr>
-          </w:p>
-        </w:tc>
-        <w:tc>
-          <w:tcPr>
-            <w:tcW w:w="7229" w:type="dxa"/>
-            <w:tcMar>
-              <w:top w:w="0" w:type="dxa"/>
-              <w:left w:w="108" w:type="dxa"/>
-              <w:bottom w:w="0" w:type="dxa"/>
-              <w:right w:w="108" w:type="dxa"/>
-            </w:tcMar>
-          </w:tcPr>
-          <w:p>
-            <w:pPr>
-              <w:pStyle w:val="Eaoaeaa"/>
-              <w:widowControl/>
-              <w:tabs>
-                <w:tab w:val="clear" w:pos="4153"/>
-                <w:tab w:val="clear" w:pos="8306"/>
-              </w:tabs>
-              <w:spacing w:before="20" w:after="20"/>
-              <w:rPr>
-                <w:rFonts w:ascii="Calibri" w:hAnsi="Calibri" w:cs="Calibri"/>
-              </w:rPr>
-            </w:pPr>
-            <w:r>
-              <w:rPr>
-                <w:rFonts w:ascii="Calibri" w:hAnsi="Calibri" w:cs="Calibri"/>
-                <w:sz w:val="22"/>
-                <w:szCs w:val="22"/>
-              </w:rPr>
-              <w:t>{{</w:t>
-            </w:r>
-            <w:r>
-              <w:rPr>
-                <w:rFonts w:ascii="Calibri" w:hAnsi="Calibri" w:cs="Calibri"/>
-                <w:sz w:val="22"/>
-                <w:szCs w:val="22"/>
-                <w:lang w:val="it-CH" w:bidi="hi-IN"/>
-              </w:rPr>
-              <w:t>personalInfo</w:t>
-            </w:r>
-            <w:r>
-              <w:rPr>
-                <w:rFonts w:ascii="Calibri" w:hAnsi="Calibri" w:cs="Calibri"/>
-                <w:sz w:val="22"/>
-                <w:szCs w:val="22"/>
-              </w:rPr>
-              <w:t>.dateOfBirth}}</w:t>
-            </w:r>
-          </w:p>
-        </w:tc>
-      </w:tr>
-    </w:tbl>
-    <w:p>
-      <w:pPr>
-        <w:pStyle w:val="Aaoeeu"/>
-        <w:widowControl/>
-        <w:spacing w:before="20" w:after="20"/>
-        <w:rPr>
-          <w:rFonts w:ascii="Calibri" w:hAnsi="Calibri" w:cs="Calibri"/>
-          <w:lang w:val="it-IT"/>
-        </w:rPr>
-      </w:pPr>
-    </w:p>
     <w:p>
       <w:pPr>
         <w:pStyle w:val="Aaoeeu"/>
@@ -1332,7 +1156,6 @@
               </w:rPr>
               <w:t>{{</w:t>
             </w:r>
-            <w:proofErr w:type="gramStart"/>
             <w:r>
               <w:rPr>
                 <w:rFonts w:ascii="Calibri" w:hAnsi="Calibri" w:cs="Calibri"/>
@@ -1344,21 +1167,7 @@
                 <w:szCs w:val="28"/>
                 <w:lang w:val="it-CH" w:bidi="hi-IN"/>
               </w:rPr>
-              <w:t>education.title</w:t>
-            </w:r>
-            <w:proofErr w:type="gramEnd"/>
-            <w:r>
-              <w:rPr>
-                <w:rFonts w:ascii="Calibri" w:hAnsi="Calibri" w:cs="Calibri"/>
-                <w:b/>
-                <w:bCs/>
-                <w:i w:val="0"/>
-                <w:iCs/>
-                <w:sz w:val="28"/>
-                <w:szCs w:val="28"/>
-                <w:lang w:val="it-CH" w:bidi="hi-IN"/>
-              </w:rPr>
-              <w:t>}}</w:t>
+              <w:t>education.title}}</w:t>
             </w:r>
           </w:p>
           <w:p>
@@ -1841,9 +1650,8 @@
                 <w:sz w:val="20"/>
                 <w:szCs w:val="24"/>
               </w:rPr>
-              <w:t>{{</w:t>
-            </w:r>
-            <w:proofErr w:type="gramStart"/>
+              <w:t>{{education.tra</w:t>
+            </w:r>
             <w:r>
               <w:rPr>
                 <w:rFonts w:ascii="Calibri" w:hAnsi="Calibri" w:cs="Calibri"/>
@@ -1852,7 +1660,7 @@
                 <w:sz w:val="20"/>
                 <w:szCs w:val="24"/>
               </w:rPr>
-              <w:t>education.tra</w:t>
+              <w:t>in</w:t>
             </w:r>
             <w:r>
               <w:rPr>
@@ -1862,28 +1670,7 @@
                 <w:sz w:val="20"/>
                 <w:szCs w:val="24"/>
               </w:rPr>
-              <w:t>in</w:t>
-            </w:r>
-            <w:r>
-              <w:rPr>
-                <w:rFonts w:ascii="Calibri" w:hAnsi="Calibri" w:cs="Calibri"/>
-                <w:i w:val="0"/>
-                <w:iCs/>
-                <w:sz w:val="20"/>
-                <w:szCs w:val="24"/>
-              </w:rPr>
-              <w:t>ingTitle</w:t>
-            </w:r>
-            <w:proofErr w:type="gramEnd"/>
-            <w:r>
-              <w:rPr>
-                <w:rFonts w:ascii="Calibri" w:hAnsi="Calibri" w:cs="Calibri"/>
-                <w:i w:val="0"/>
-                <w:iCs/>
-                <w:sz w:val="20"/>
-                <w:szCs w:val="24"/>
-              </w:rPr>
-              <w:t>}}</w:t>
+              <w:t>ingTitle}}</w:t>
             </w:r>
           </w:p>
         </w:tc>

</xml_diff>

<commit_message>
Add SQL skill and GDPR footer; update translations
Insert SQL skill entry (set to 75% advanced) and remove previous SQL 30% entry in the skills section. Add a new footer paragraph for GDPR consent in index.html and wire translation keys (art4gdpr) into English and Italian locale files. Revise skills intro text in both en.json and it.json for clearer wording. Also update the CV binary (src/profile/CV_Mirko_Ando.docx).
</commit_message>
<xml_diff>
--- a/src/profile/CV_Mirko_Ando.docx
+++ b/src/profile/CV_Mirko_Ando.docx
@@ -1156,6 +1156,7 @@
               </w:rPr>
               <w:t>{{</w:t>
             </w:r>
+            <w:proofErr w:type="gramStart"/>
             <w:r>
               <w:rPr>
                 <w:rFonts w:ascii="Calibri" w:hAnsi="Calibri" w:cs="Calibri"/>
@@ -1167,7 +1168,21 @@
                 <w:szCs w:val="28"/>
                 <w:lang w:val="it-CH" w:bidi="hi-IN"/>
               </w:rPr>
-              <w:t>education.title}}</w:t>
+              <w:t>education.title</w:t>
+            </w:r>
+            <w:proofErr w:type="gramEnd"/>
+            <w:r>
+              <w:rPr>
+                <w:rFonts w:ascii="Calibri" w:hAnsi="Calibri" w:cs="Calibri"/>
+                <w:b/>
+                <w:bCs/>
+                <w:i w:val="0"/>
+                <w:iCs/>
+                <w:sz w:val="28"/>
+                <w:szCs w:val="28"/>
+                <w:lang w:val="it-CH" w:bidi="hi-IN"/>
+              </w:rPr>
+              <w:t>}}</w:t>
             </w:r>
           </w:p>
           <w:p>
@@ -1650,8 +1665,9 @@
                 <w:sz w:val="20"/>
                 <w:szCs w:val="24"/>
               </w:rPr>
-              <w:t>{{education.tra</w:t>
-            </w:r>
+              <w:t>{{</w:t>
+            </w:r>
+            <w:proofErr w:type="gramStart"/>
             <w:r>
               <w:rPr>
                 <w:rFonts w:ascii="Calibri" w:hAnsi="Calibri" w:cs="Calibri"/>
@@ -1660,7 +1676,7 @@
                 <w:sz w:val="20"/>
                 <w:szCs w:val="24"/>
               </w:rPr>
-              <w:t>in</w:t>
+              <w:t>education.tra</w:t>
             </w:r>
             <w:r>
               <w:rPr>
@@ -1670,7 +1686,28 @@
                 <w:sz w:val="20"/>
                 <w:szCs w:val="24"/>
               </w:rPr>
-              <w:t>ingTitle}}</w:t>
+              <w:t>in</w:t>
+            </w:r>
+            <w:r>
+              <w:rPr>
+                <w:rFonts w:ascii="Calibri" w:hAnsi="Calibri" w:cs="Calibri"/>
+                <w:i w:val="0"/>
+                <w:iCs/>
+                <w:sz w:val="20"/>
+                <w:szCs w:val="24"/>
+              </w:rPr>
+              <w:t>ingTitle</w:t>
+            </w:r>
+            <w:proofErr w:type="gramEnd"/>
+            <w:r>
+              <w:rPr>
+                <w:rFonts w:ascii="Calibri" w:hAnsi="Calibri" w:cs="Calibri"/>
+                <w:i w:val="0"/>
+                <w:iCs/>
+                <w:sz w:val="20"/>
+                <w:szCs w:val="24"/>
+              </w:rPr>
+              <w:t>}}</w:t>
             </w:r>
           </w:p>
         </w:tc>
@@ -2718,7 +2755,7 @@
                 <w:rFonts w:ascii="Calibri" w:hAnsi="Calibri" w:cs="Calibri"/>
                 <w:lang w:val="it-IT"/>
               </w:rPr>
-              <w:t>Una vista sintetica delle competenze operative che utilizzo nei progetti, suddivise per linguaggi e ambienti di lavoro.</w:t>
+              <w:t>Una vista sintetica delle competenze operative che utilizzo nei progetti, suddivise per linguaggi e ambienti di lavoro batata su valutazione ottenuta nei vari progetti, qualifiche acquisite e confidenza.</w:t>
             </w:r>
           </w:p>
           <w:p>
@@ -2735,24 +2772,19 @@
           <w:p>
             <w:pPr>
               <w:pStyle w:val="Eaoaeaa"/>
-              <w:widowControl/>
-              <w:spacing w:before="20" w:after="20"/>
-              <w:rPr>
-                <w:rFonts w:ascii="Calibri" w:hAnsi="Calibri" w:cs="Calibri"/>
-                <w:lang w:val="it-IT"/>
-              </w:rPr>
-            </w:pPr>
-          </w:p>
-          <w:p>
-            <w:pPr>
-              <w:pStyle w:val="Eaoaeaa"/>
-              <w:widowControl/>
-              <w:spacing w:before="20" w:after="20"/>
-              <w:rPr>
-                <w:rFonts w:ascii="Calibri" w:hAnsi="Calibri" w:cs="Calibri"/>
-                <w:lang w:val="it-IT"/>
-              </w:rPr>
-            </w:pPr>
+              <w:spacing w:before="20" w:after="20"/>
+              <w:rPr>
+                <w:rFonts w:ascii="Calibri" w:hAnsi="Calibri" w:cs="Calibri"/>
+                <w:lang w:val="it-CH"/>
+              </w:rPr>
+            </w:pPr>
+            <w:r>
+              <w:rPr>
+                <w:rFonts w:ascii="Calibri" w:hAnsi="Calibri" w:cs="Calibri"/>
+                <w:lang w:val="it-CH"/>
+              </w:rPr>
+              <w:t>Scala livelli: Base &lt; 50% | Intermedio 50-69% | Avanzato &gt;= 70%</w:t>
+            </w:r>
           </w:p>
         </w:tc>
       </w:tr>
@@ -3068,7 +3100,7 @@
                 <w:szCs w:val="12"/>
                 <w:lang w:val="it-IT"/>
               </w:rPr>
-              <w:t>Java</w:t>
+              <w:t>SQL</w:t>
             </w:r>
           </w:p>
         </w:tc>
@@ -3125,7 +3157,7 @@
                 <w:szCs w:val="16"/>
                 <w:lang w:val="it-IT"/>
               </w:rPr>
-              <w:t>Intermedio</w:t>
+              <w:t>Avanzato</w:t>
             </w:r>
           </w:p>
         </w:tc>
@@ -3264,7 +3296,7 @@
                 <w:szCs w:val="12"/>
                 <w:lang w:val="it-IT"/>
               </w:rPr>
-              <w:t>PHP</w:t>
+              <w:t>JAVA</w:t>
             </w:r>
           </w:p>
         </w:tc>
@@ -3321,7 +3353,7 @@
                 <w:szCs w:val="16"/>
                 <w:lang w:val="it-IT"/>
               </w:rPr>
-              <w:t>Base</w:t>
+              <w:t>Intermedio</w:t>
             </w:r>
           </w:p>
         </w:tc>
@@ -3362,7 +3394,7 @@
                 <w:szCs w:val="12"/>
                 <w:lang w:val="it-IT"/>
               </w:rPr>
-              <w:t>SQL</w:t>
+              <w:t>PHP</w:t>
             </w:r>
           </w:p>
         </w:tc>
@@ -4303,6 +4335,152 @@
                 <w:t>https://mirkoandoportfolio.netlify.app/</w:t>
               </w:r>
             </w:hyperlink>
+          </w:p>
+        </w:tc>
+      </w:tr>
+      <w:tr>
+        <w:tc>
+          <w:tcPr>
+            <w:tcW w:w="3085" w:type="dxa"/>
+            <w:tcMar>
+              <w:top w:w="0" w:type="dxa"/>
+              <w:left w:w="108" w:type="dxa"/>
+              <w:bottom w:w="0" w:type="dxa"/>
+              <w:right w:w="108" w:type="dxa"/>
+            </w:tcMar>
+          </w:tcPr>
+          <w:p>
+            <w:pPr>
+              <w:pStyle w:val="Aeeaoaeaa1"/>
+              <w:widowControl/>
+              <w:rPr>
+                <w:rFonts w:ascii="Calibri" w:hAnsi="Calibri" w:cs="Calibri"/>
+                <w:b w:val="0"/>
+                <w:smallCaps/>
+                <w:sz w:val="24"/>
+                <w:lang w:val="it-IT"/>
+              </w:rPr>
+            </w:pPr>
+          </w:p>
+        </w:tc>
+        <w:tc>
+          <w:tcPr>
+            <w:tcW w:w="236" w:type="dxa"/>
+            <w:tcMar>
+              <w:top w:w="0" w:type="dxa"/>
+              <w:left w:w="108" w:type="dxa"/>
+              <w:bottom w:w="0" w:type="dxa"/>
+              <w:right w:w="108" w:type="dxa"/>
+            </w:tcMar>
+          </w:tcPr>
+          <w:p>
+            <w:pPr>
+              <w:pStyle w:val="Aaoeeu"/>
+              <w:widowControl/>
+              <w:snapToGrid w:val="0"/>
+              <w:jc w:val="right"/>
+              <w:rPr>
+                <w:rFonts w:ascii="Calibri" w:hAnsi="Calibri" w:cs="Calibri"/>
+                <w:sz w:val="24"/>
+                <w:lang w:val="it-IT"/>
+              </w:rPr>
+            </w:pPr>
+          </w:p>
+          <w:p>
+            <w:pPr>
+              <w:pStyle w:val="Aaoeeu"/>
+              <w:widowControl/>
+              <w:snapToGrid w:val="0"/>
+              <w:jc w:val="right"/>
+              <w:rPr>
+                <w:rFonts w:ascii="Calibri" w:hAnsi="Calibri" w:cs="Calibri"/>
+                <w:sz w:val="24"/>
+                <w:lang w:val="it-IT"/>
+              </w:rPr>
+            </w:pPr>
+          </w:p>
+        </w:tc>
+        <w:tc>
+          <w:tcPr>
+            <w:tcW w:w="7229" w:type="dxa"/>
+            <w:tcMar>
+              <w:top w:w="0" w:type="dxa"/>
+              <w:left w:w="108" w:type="dxa"/>
+              <w:bottom w:w="0" w:type="dxa"/>
+              <w:right w:w="108" w:type="dxa"/>
+            </w:tcMar>
+          </w:tcPr>
+          <w:p>
+            <w:pPr>
+              <w:rPr>
+                <w:rFonts w:ascii="Consolas" w:hAnsi="Consolas" w:cs="Calibri"/>
+                <w:i/>
+                <w:iCs/>
+                <w:sz w:val="22"/>
+                <w:szCs w:val="22"/>
+              </w:rPr>
+            </w:pPr>
+          </w:p>
+          <w:p>
+            <w:pPr>
+              <w:rPr>
+                <w:rFonts w:ascii="Consolas" w:hAnsi="Consolas"/>
+                <w:i/>
+                <w:iCs/>
+                <w:lang w:eastAsia="ko-KR" w:bidi="ar-SA"/>
+              </w:rPr>
+            </w:pPr>
+            <w:r>
+              <w:rPr>
+                <w:rFonts w:ascii="Consolas" w:hAnsi="Consolas" w:cs="Calibri"/>
+                <w:i/>
+                <w:iCs/>
+                <w:sz w:val="22"/>
+                <w:szCs w:val="22"/>
+              </w:rPr>
+              <w:t>{{</w:t>
+            </w:r>
+            <w:r>
+              <w:rPr>
+                <w:rFonts w:ascii="Consolas" w:hAnsi="Consolas" w:cs="Calibri"/>
+                <w:i/>
+                <w:iCs/>
+                <w:sz w:val="22"/>
+                <w:szCs w:val="22"/>
+                <w:lang w:val="it-CH"/>
+              </w:rPr>
+              <w:t>footer</w:t>
+            </w:r>
+            <w:r>
+              <w:rPr>
+                <w:rFonts w:ascii="Consolas" w:hAnsi="Consolas" w:cs="Calibri"/>
+                <w:i/>
+                <w:iCs/>
+                <w:sz w:val="22"/>
+                <w:szCs w:val="22"/>
+              </w:rPr>
+              <w:t>.</w:t>
+            </w:r>
+            <w:r>
+              <w:rPr>
+                <w:rFonts w:ascii="Consolas" w:hAnsi="Consolas" w:cs="Calibri"/>
+                <w:i/>
+                <w:iCs/>
+                <w:sz w:val="22"/>
+                <w:szCs w:val="22"/>
+              </w:rPr>
+              <w:t>art4gdpr</w:t>
+            </w:r>
+            <w:r>
+              <w:rPr>
+                <w:rFonts w:ascii="Consolas" w:hAnsi="Consolas" w:cs="Calibri"/>
+                <w:i/>
+                <w:iCs/>
+                <w:sz w:val="22"/>
+                <w:szCs w:val="22"/>
+              </w:rPr>
+              <w:t>}}</w:t>
+            </w:r>
           </w:p>
         </w:tc>
       </w:tr>
@@ -4915,7 +5093,6 @@
   <w:style w:type="character" w:default="1" w:styleId="Carpredefinitoparagrafo">
     <w:name w:val="Default Paragraph Font"/>
     <w:uiPriority w:val="1"/>
-    <w:semiHidden/>
     <w:unhideWhenUsed/>
   </w:style>
   <w:style w:type="table" w:default="1" w:styleId="Tabellanormale">

</xml_diff>

<commit_message>
Add SQL skill and GDPR footer translations
Add a new SQL skill entry in index.html (level advanced, 75%) and remove the previous 30% SQL entry. Insert a new i18n footer paragraph and add corresponding art4gdpr translations to English and Italian JSON files. Also refine the 'skills.intro' text in both locales. Binary CV (src/profile/CV_Mirko_Ando.docx) was updated as well.
</commit_message>
<xml_diff>
--- a/src/profile/CV_Mirko_Ando.docx
+++ b/src/profile/CV_Mirko_Ando.docx
@@ -488,7 +488,7 @@
                 <w:b w:val="0"/>
                 <w:lang w:val="it-IT"/>
               </w:rPr>
-              <w:t>Indirizzo</w:t>
+              <w:t>Telefono</w:t>
             </w:r>
           </w:p>
         </w:tc>
@@ -564,7 +564,7 @@
                 <w:sz w:val="22"/>
                 <w:szCs w:val="22"/>
               </w:rPr>
-              <w:t>.address}}</w:t>
+              <w:t>.phone}}</w:t>
             </w:r>
           </w:p>
         </w:tc>
@@ -597,7 +597,7 @@
                 <w:b w:val="0"/>
                 <w:lang w:val="it-IT"/>
               </w:rPr>
-              <w:t>Telefono</w:t>
+              <w:t>E-mail</w:t>
             </w:r>
           </w:p>
         </w:tc>
@@ -675,7 +675,7 @@
                 <w:sz w:val="22"/>
                 <w:szCs w:val="22"/>
               </w:rPr>
-              <w:t>.phone}}</w:t>
+              <w:t>.email}}</w:t>
             </w:r>
           </w:p>
         </w:tc>
@@ -708,7 +708,7 @@
                 <w:b w:val="0"/>
                 <w:lang w:val="it-IT"/>
               </w:rPr>
-              <w:t>E-mail</w:t>
+              <w:t>Nazionalità</w:t>
             </w:r>
           </w:p>
         </w:tc>
@@ -786,40 +786,11 @@
                 <w:sz w:val="22"/>
                 <w:szCs w:val="22"/>
               </w:rPr>
-              <w:t>.email}}</w:t>
+              <w:t>.nationality}}</w:t>
             </w:r>
           </w:p>
         </w:tc>
       </w:tr>
-    </w:tbl>
-    <w:p>
-      <w:pPr>
-        <w:pStyle w:val="Aaoeeu"/>
-        <w:widowControl/>
-        <w:spacing w:before="120"/>
-        <w:rPr>
-          <w:rFonts w:ascii="Calibri" w:hAnsi="Calibri" w:cs="Calibri"/>
-          <w:sz w:val="16"/>
-          <w:lang w:val="it-IT"/>
-        </w:rPr>
-      </w:pPr>
-    </w:p>
-    <w:tbl>
-      <w:tblPr>
-        <w:tblW w:w="10456" w:type="dxa"/>
-        <w:tblInd w:w="-108" w:type="dxa"/>
-        <w:tblLayout w:type="fixed"/>
-        <w:tblCellMar>
-          <w:left w:w="10" w:type="dxa"/>
-          <w:right w:w="10" w:type="dxa"/>
-        </w:tblCellMar>
-        <w:tblLook w:val="0000" w:firstRow="0" w:lastRow="0" w:firstColumn="0" w:lastColumn="0" w:noHBand="0" w:noVBand="0"/>
-      </w:tblPr>
-      <w:tblGrid>
-        <w:gridCol w:w="2943"/>
-        <w:gridCol w:w="284"/>
-        <w:gridCol w:w="7229"/>
-      </w:tblGrid>
       <w:tr>
         <w:tc>
           <w:tcPr>
@@ -835,7 +806,7 @@
             <w:pPr>
               <w:pStyle w:val="Aeeaoaeaa1"/>
               <w:widowControl/>
-              <w:spacing w:before="20" w:after="20"/>
+              <w:spacing w:before="40" w:after="40"/>
               <w:rPr>
                 <w:rFonts w:ascii="Calibri" w:hAnsi="Calibri" w:cs="Calibri"/>
                 <w:b w:val="0"/>
@@ -848,7 +819,7 @@
                 <w:b w:val="0"/>
                 <w:lang w:val="it-IT"/>
               </w:rPr>
-              <w:t>Nazionalità</w:t>
+              <w:t>Data di nascita</w:t>
             </w:r>
           </w:p>
         </w:tc>
@@ -867,9 +838,10 @@
               <w:pStyle w:val="Aaoeeu"/>
               <w:widowControl/>
               <w:snapToGrid w:val="0"/>
-              <w:spacing w:before="20" w:after="20"/>
-              <w:rPr>
-                <w:rFonts w:ascii="Calibri" w:hAnsi="Calibri" w:cs="Calibri"/>
+              <w:spacing w:before="40" w:after="40"/>
+              <w:rPr>
+                <w:rFonts w:ascii="Calibri" w:hAnsi="Calibri" w:cs="Calibri"/>
+                <w:sz w:val="22"/>
                 <w:lang w:val="it-IT"/>
               </w:rPr>
             </w:pPr>
@@ -894,10 +866,11 @@
                 <w:tab w:val="clear" w:pos="8306"/>
               </w:tabs>
               <w:snapToGrid w:val="0"/>
-              <w:spacing w:before="20" w:after="20"/>
-              <w:rPr>
-                <w:rFonts w:ascii="Calibri" w:hAnsi="Calibri" w:cs="Calibri"/>
-                <w:lang w:val="it-IT"/>
+              <w:spacing w:before="40" w:after="40"/>
+              <w:rPr>
+                <w:rFonts w:ascii="Calibri" w:hAnsi="Calibri" w:cs="Calibri"/>
+                <w:sz w:val="22"/>
+                <w:szCs w:val="22"/>
               </w:rPr>
             </w:pPr>
             <w:r>
@@ -923,161 +896,12 @@
                 <w:sz w:val="22"/>
                 <w:szCs w:val="22"/>
               </w:rPr>
-              <w:t>.nationality}}</w:t>
+              <w:t>.dateOfBirth}}</w:t>
             </w:r>
           </w:p>
         </w:tc>
       </w:tr>
     </w:tbl>
-    <w:p>
-      <w:pPr>
-        <w:pStyle w:val="Aaoeeu"/>
-        <w:widowControl/>
-        <w:spacing w:before="20" w:after="20"/>
-        <w:rPr>
-          <w:rFonts w:ascii="Calibri" w:hAnsi="Calibri" w:cs="Calibri"/>
-          <w:sz w:val="10"/>
-          <w:lang w:val="it-IT"/>
-        </w:rPr>
-      </w:pPr>
-    </w:p>
-    <w:tbl>
-      <w:tblPr>
-        <w:tblW w:w="10456" w:type="dxa"/>
-        <w:tblInd w:w="-108" w:type="dxa"/>
-        <w:tblLayout w:type="fixed"/>
-        <w:tblCellMar>
-          <w:left w:w="10" w:type="dxa"/>
-          <w:right w:w="10" w:type="dxa"/>
-        </w:tblCellMar>
-        <w:tblLook w:val="0000" w:firstRow="0" w:lastRow="0" w:firstColumn="0" w:lastColumn="0" w:noHBand="0" w:noVBand="0"/>
-      </w:tblPr>
-      <w:tblGrid>
-        <w:gridCol w:w="2943"/>
-        <w:gridCol w:w="284"/>
-        <w:gridCol w:w="7229"/>
-      </w:tblGrid>
-      <w:tr>
-        <w:trPr>
-          <w:trHeight w:val="80"/>
-        </w:trPr>
-        <w:tc>
-          <w:tcPr>
-            <w:tcW w:w="2943" w:type="dxa"/>
-            <w:tcMar>
-              <w:top w:w="0" w:type="dxa"/>
-              <w:left w:w="108" w:type="dxa"/>
-              <w:bottom w:w="0" w:type="dxa"/>
-              <w:right w:w="108" w:type="dxa"/>
-            </w:tcMar>
-          </w:tcPr>
-          <w:p>
-            <w:pPr>
-              <w:pStyle w:val="Aeeaoaeaa1"/>
-              <w:widowControl/>
-              <w:spacing w:before="20" w:after="20"/>
-              <w:rPr>
-                <w:rFonts w:ascii="Calibri" w:hAnsi="Calibri" w:cs="Calibri"/>
-                <w:b w:val="0"/>
-                <w:lang w:val="it-IT"/>
-              </w:rPr>
-            </w:pPr>
-            <w:r>
-              <w:rPr>
-                <w:rFonts w:ascii="Calibri" w:hAnsi="Calibri" w:cs="Calibri"/>
-                <w:b w:val="0"/>
-                <w:lang w:val="it-IT"/>
-              </w:rPr>
-              <w:t>Data di nascita</w:t>
-            </w:r>
-          </w:p>
-        </w:tc>
-        <w:tc>
-          <w:tcPr>
-            <w:tcW w:w="284" w:type="dxa"/>
-            <w:tcMar>
-              <w:top w:w="0" w:type="dxa"/>
-              <w:left w:w="108" w:type="dxa"/>
-              <w:bottom w:w="0" w:type="dxa"/>
-              <w:right w:w="108" w:type="dxa"/>
-            </w:tcMar>
-          </w:tcPr>
-          <w:p>
-            <w:pPr>
-              <w:pStyle w:val="Aaoeeu"/>
-              <w:widowControl/>
-              <w:snapToGrid w:val="0"/>
-              <w:spacing w:before="20" w:after="20"/>
-              <w:rPr>
-                <w:rFonts w:ascii="Calibri" w:hAnsi="Calibri" w:cs="Calibri"/>
-                <w:lang w:val="it-IT"/>
-              </w:rPr>
-            </w:pPr>
-          </w:p>
-        </w:tc>
-        <w:tc>
-          <w:tcPr>
-            <w:tcW w:w="7229" w:type="dxa"/>
-            <w:tcMar>
-              <w:top w:w="0" w:type="dxa"/>
-              <w:left w:w="108" w:type="dxa"/>
-              <w:bottom w:w="0" w:type="dxa"/>
-              <w:right w:w="108" w:type="dxa"/>
-            </w:tcMar>
-          </w:tcPr>
-          <w:p>
-            <w:pPr>
-              <w:pStyle w:val="Eaoaeaa"/>
-              <w:widowControl/>
-              <w:tabs>
-                <w:tab w:val="clear" w:pos="4153"/>
-                <w:tab w:val="clear" w:pos="8306"/>
-              </w:tabs>
-              <w:spacing w:before="20" w:after="20"/>
-              <w:rPr>
-                <w:rFonts w:ascii="Calibri" w:hAnsi="Calibri" w:cs="Calibri"/>
-              </w:rPr>
-            </w:pPr>
-            <w:r>
-              <w:rPr>
-                <w:rFonts w:ascii="Calibri" w:hAnsi="Calibri" w:cs="Calibri"/>
-                <w:sz w:val="22"/>
-                <w:szCs w:val="22"/>
-              </w:rPr>
-              <w:t>{{</w:t>
-            </w:r>
-            <w:r>
-              <w:rPr>
-                <w:rFonts w:ascii="Calibri" w:hAnsi="Calibri" w:cs="Calibri"/>
-                <w:sz w:val="22"/>
-                <w:szCs w:val="22"/>
-                <w:lang w:val="it-CH" w:bidi="hi-IN"/>
-              </w:rPr>
-              <w:t>personalInfo</w:t>
-            </w:r>
-            <w:r>
-              <w:rPr>
-                <w:rFonts w:ascii="Calibri" w:hAnsi="Calibri" w:cs="Calibri"/>
-                <w:sz w:val="22"/>
-                <w:szCs w:val="22"/>
-              </w:rPr>
-              <w:t>.dateOfBirth}}</w:t>
-            </w:r>
-          </w:p>
-        </w:tc>
-      </w:tr>
-    </w:tbl>
-    <w:p>
-      <w:pPr>
-        <w:pStyle w:val="Aaoeeu"/>
-        <w:widowControl/>
-        <w:spacing w:before="20" w:after="20"/>
-        <w:rPr>
-          <w:rFonts w:ascii="Calibri" w:hAnsi="Calibri" w:cs="Calibri"/>
-          <w:lang w:val="it-IT"/>
-        </w:rPr>
-      </w:pPr>
-    </w:p>
     <w:p>
       <w:pPr>
         <w:pStyle w:val="Aaoeeu"/>
@@ -2931,7 +2755,7 @@
                 <w:rFonts w:ascii="Calibri" w:hAnsi="Calibri" w:cs="Calibri"/>
                 <w:lang w:val="it-IT"/>
               </w:rPr>
-              <w:t>Una vista sintetica delle competenze operative che utilizzo nei progetti, suddivise per linguaggi e ambienti di lavoro.</w:t>
+              <w:t>Una vista sintetica delle competenze operative che utilizzo nei progetti, suddivise per linguaggi e ambienti di lavoro batata su valutazione ottenuta nei vari progetti, qualifiche acquisite e confidenza.</w:t>
             </w:r>
           </w:p>
           <w:p>
@@ -2948,24 +2772,19 @@
           <w:p>
             <w:pPr>
               <w:pStyle w:val="Eaoaeaa"/>
-              <w:widowControl/>
-              <w:spacing w:before="20" w:after="20"/>
-              <w:rPr>
-                <w:rFonts w:ascii="Calibri" w:hAnsi="Calibri" w:cs="Calibri"/>
-                <w:lang w:val="it-IT"/>
-              </w:rPr>
-            </w:pPr>
-          </w:p>
-          <w:p>
-            <w:pPr>
-              <w:pStyle w:val="Eaoaeaa"/>
-              <w:widowControl/>
-              <w:spacing w:before="20" w:after="20"/>
-              <w:rPr>
-                <w:rFonts w:ascii="Calibri" w:hAnsi="Calibri" w:cs="Calibri"/>
-                <w:lang w:val="it-IT"/>
-              </w:rPr>
-            </w:pPr>
+              <w:spacing w:before="20" w:after="20"/>
+              <w:rPr>
+                <w:rFonts w:ascii="Calibri" w:hAnsi="Calibri" w:cs="Calibri"/>
+                <w:lang w:val="it-CH"/>
+              </w:rPr>
+            </w:pPr>
+            <w:r>
+              <w:rPr>
+                <w:rFonts w:ascii="Calibri" w:hAnsi="Calibri" w:cs="Calibri"/>
+                <w:lang w:val="it-CH"/>
+              </w:rPr>
+              <w:t>Scala livelli: Base &lt; 50% | Intermedio 50-69% | Avanzato &gt;= 70%</w:t>
+            </w:r>
           </w:p>
         </w:tc>
       </w:tr>
@@ -3281,7 +3100,7 @@
                 <w:szCs w:val="12"/>
                 <w:lang w:val="it-IT"/>
               </w:rPr>
-              <w:t>Java</w:t>
+              <w:t>SQL</w:t>
             </w:r>
           </w:p>
         </w:tc>
@@ -3338,7 +3157,7 @@
                 <w:szCs w:val="16"/>
                 <w:lang w:val="it-IT"/>
               </w:rPr>
-              <w:t>Intermedio</w:t>
+              <w:t>Avanzato</w:t>
             </w:r>
           </w:p>
         </w:tc>
@@ -3477,7 +3296,7 @@
                 <w:szCs w:val="12"/>
                 <w:lang w:val="it-IT"/>
               </w:rPr>
-              <w:t>PHP</w:t>
+              <w:t>JAVA</w:t>
             </w:r>
           </w:p>
         </w:tc>
@@ -3534,7 +3353,7 @@
                 <w:szCs w:val="16"/>
                 <w:lang w:val="it-IT"/>
               </w:rPr>
-              <w:t>Base</w:t>
+              <w:t>Intermedio</w:t>
             </w:r>
           </w:p>
         </w:tc>
@@ -3575,7 +3394,7 @@
                 <w:szCs w:val="12"/>
                 <w:lang w:val="it-IT"/>
               </w:rPr>
-              <w:t>SQL</w:t>
+              <w:t>PHP</w:t>
             </w:r>
           </w:p>
         </w:tc>
@@ -4516,6 +4335,152 @@
                 <w:t>https://mirkoandoportfolio.netlify.app/</w:t>
               </w:r>
             </w:hyperlink>
+          </w:p>
+        </w:tc>
+      </w:tr>
+      <w:tr>
+        <w:tc>
+          <w:tcPr>
+            <w:tcW w:w="3085" w:type="dxa"/>
+            <w:tcMar>
+              <w:top w:w="0" w:type="dxa"/>
+              <w:left w:w="108" w:type="dxa"/>
+              <w:bottom w:w="0" w:type="dxa"/>
+              <w:right w:w="108" w:type="dxa"/>
+            </w:tcMar>
+          </w:tcPr>
+          <w:p>
+            <w:pPr>
+              <w:pStyle w:val="Aeeaoaeaa1"/>
+              <w:widowControl/>
+              <w:rPr>
+                <w:rFonts w:ascii="Calibri" w:hAnsi="Calibri" w:cs="Calibri"/>
+                <w:b w:val="0"/>
+                <w:smallCaps/>
+                <w:sz w:val="24"/>
+                <w:lang w:val="it-IT"/>
+              </w:rPr>
+            </w:pPr>
+          </w:p>
+        </w:tc>
+        <w:tc>
+          <w:tcPr>
+            <w:tcW w:w="236" w:type="dxa"/>
+            <w:tcMar>
+              <w:top w:w="0" w:type="dxa"/>
+              <w:left w:w="108" w:type="dxa"/>
+              <w:bottom w:w="0" w:type="dxa"/>
+              <w:right w:w="108" w:type="dxa"/>
+            </w:tcMar>
+          </w:tcPr>
+          <w:p>
+            <w:pPr>
+              <w:pStyle w:val="Aaoeeu"/>
+              <w:widowControl/>
+              <w:snapToGrid w:val="0"/>
+              <w:jc w:val="right"/>
+              <w:rPr>
+                <w:rFonts w:ascii="Calibri" w:hAnsi="Calibri" w:cs="Calibri"/>
+                <w:sz w:val="24"/>
+                <w:lang w:val="it-IT"/>
+              </w:rPr>
+            </w:pPr>
+          </w:p>
+          <w:p>
+            <w:pPr>
+              <w:pStyle w:val="Aaoeeu"/>
+              <w:widowControl/>
+              <w:snapToGrid w:val="0"/>
+              <w:jc w:val="right"/>
+              <w:rPr>
+                <w:rFonts w:ascii="Calibri" w:hAnsi="Calibri" w:cs="Calibri"/>
+                <w:sz w:val="24"/>
+                <w:lang w:val="it-IT"/>
+              </w:rPr>
+            </w:pPr>
+          </w:p>
+        </w:tc>
+        <w:tc>
+          <w:tcPr>
+            <w:tcW w:w="7229" w:type="dxa"/>
+            <w:tcMar>
+              <w:top w:w="0" w:type="dxa"/>
+              <w:left w:w="108" w:type="dxa"/>
+              <w:bottom w:w="0" w:type="dxa"/>
+              <w:right w:w="108" w:type="dxa"/>
+            </w:tcMar>
+          </w:tcPr>
+          <w:p>
+            <w:pPr>
+              <w:rPr>
+                <w:rFonts w:ascii="Consolas" w:hAnsi="Consolas" w:cs="Calibri"/>
+                <w:i/>
+                <w:iCs/>
+                <w:sz w:val="22"/>
+                <w:szCs w:val="22"/>
+              </w:rPr>
+            </w:pPr>
+          </w:p>
+          <w:p>
+            <w:pPr>
+              <w:rPr>
+                <w:rFonts w:ascii="Consolas" w:hAnsi="Consolas"/>
+                <w:i/>
+                <w:iCs/>
+                <w:lang w:eastAsia="ko-KR" w:bidi="ar-SA"/>
+              </w:rPr>
+            </w:pPr>
+            <w:r>
+              <w:rPr>
+                <w:rFonts w:ascii="Consolas" w:hAnsi="Consolas" w:cs="Calibri"/>
+                <w:i/>
+                <w:iCs/>
+                <w:sz w:val="22"/>
+                <w:szCs w:val="22"/>
+              </w:rPr>
+              <w:t>{{</w:t>
+            </w:r>
+            <w:r>
+              <w:rPr>
+                <w:rFonts w:ascii="Consolas" w:hAnsi="Consolas" w:cs="Calibri"/>
+                <w:i/>
+                <w:iCs/>
+                <w:sz w:val="22"/>
+                <w:szCs w:val="22"/>
+                <w:lang w:val="it-CH"/>
+              </w:rPr>
+              <w:t>footer</w:t>
+            </w:r>
+            <w:r>
+              <w:rPr>
+                <w:rFonts w:ascii="Consolas" w:hAnsi="Consolas" w:cs="Calibri"/>
+                <w:i/>
+                <w:iCs/>
+                <w:sz w:val="22"/>
+                <w:szCs w:val="22"/>
+              </w:rPr>
+              <w:t>.</w:t>
+            </w:r>
+            <w:r>
+              <w:rPr>
+                <w:rFonts w:ascii="Consolas" w:hAnsi="Consolas" w:cs="Calibri"/>
+                <w:i/>
+                <w:iCs/>
+                <w:sz w:val="22"/>
+                <w:szCs w:val="22"/>
+              </w:rPr>
+              <w:t>art4gdpr</w:t>
+            </w:r>
+            <w:r>
+              <w:rPr>
+                <w:rFonts w:ascii="Consolas" w:hAnsi="Consolas" w:cs="Calibri"/>
+                <w:i/>
+                <w:iCs/>
+                <w:sz w:val="22"/>
+                <w:szCs w:val="22"/>
+              </w:rPr>
+              <w:t>}}</w:t>
+            </w:r>
           </w:p>
         </w:tc>
       </w:tr>
@@ -5128,7 +5093,6 @@
   <w:style w:type="character" w:default="1" w:styleId="Carpredefinitoparagrafo">
     <w:name w:val="Default Paragraph Font"/>
     <w:uiPriority w:val="1"/>
-    <w:semiHidden/>
     <w:unhideWhenUsed/>
   </w:style>
   <w:style w:type="table" w:default="1" w:styleId="Tabellanormale">

</xml_diff>